<commit_message>
template: 更新 HRD 系列模板
</commit_message>
<xml_diff>
--- a/WebContent/docx/HRDscore报告-佛山市第一人民医院.docx
+++ b/WebContent/docx/HRDscore报告-佛山市第一人民医院.docx
@@ -709,7 +709,7 @@
           </mc:Choice>
           <mc:Fallback>
             <w:pict>
-              <v:group id="_x0000_s1026" o:spid="_x0000_s1026" o:spt="203" style="position:absolute;left:0pt;margin-left:-26.35pt;margin-top:-60.8pt;height:89.6pt;width:528.6pt;z-index:251661312;mso-width-relative:page;mso-height-relative:page;" coordorigin="2472,581" coordsize="10572,1792" o:gfxdata="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">
+              <v:group id="_x0000_s1026" o:spid="_x0000_s1026" o:spt="203" style="position:absolute;left:0pt;margin-left:-26.35pt;margin-top:-60.8pt;height:89.6pt;width:528.6pt;z-index:251661312;mso-width-relative:page;mso-height-relative:page;" coordorigin="2472,581" coordsize="10572,1792" o:gfxdata="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">
                 <o:lock v:ext="edit" aspectratio="f"/>
                 <v:shape id="图片 8" o:spid="_x0000_s1026" o:spt="75" type="#_x0000_t75" style="position:absolute;left:2472;top:581;height:1793;width:1648;" filled="f" o:preferrelative="t" stroked="f" coordsize="21600,21600" o:gfxdata="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">
                   <v:fill on="f" focussize="0,0"/>
@@ -3134,15 +3134,15 @@
           </w14:shadow>
         </w:rPr>
       </w:pPr>
-      <w:bookmarkStart w:id="2" w:name="_Toc21669"/>
+      <w:bookmarkStart w:id="2" w:name="_Toc14123"/>
       <w:bookmarkStart w:id="3" w:name="_Toc6873"/>
-      <w:bookmarkStart w:id="4" w:name="_Toc107825547"/>
-      <w:bookmarkStart w:id="5" w:name="_Toc3619"/>
-      <w:bookmarkStart w:id="6" w:name="_Toc30143_WPSOffice_Level1"/>
-      <w:bookmarkStart w:id="7" w:name="_Toc21009_WPSOffice_Level1"/>
-      <w:bookmarkStart w:id="8" w:name="_Toc13806"/>
+      <w:bookmarkStart w:id="4" w:name="_Toc3619"/>
+      <w:bookmarkStart w:id="5" w:name="_Toc30143_WPSOffice_Level1"/>
+      <w:bookmarkStart w:id="6" w:name="_Toc21669"/>
+      <w:bookmarkStart w:id="7" w:name="_Toc107825547"/>
+      <w:bookmarkStart w:id="8" w:name="_Toc21009_WPSOffice_Level1"/>
       <w:bookmarkStart w:id="9" w:name="_Toc24178_WPSOffice_Level1"/>
-      <w:bookmarkStart w:id="10" w:name="_Toc14123"/>
+      <w:bookmarkStart w:id="10" w:name="_Toc13806"/>
       <w:r>
         <w:rPr>
           <w:color w:val="62B541"/>
@@ -4015,14 +4015,14 @@
           </w14:shadow>
         </w:rPr>
       </w:pPr>
-      <w:bookmarkStart w:id="11" w:name="_Toc17451"/>
-      <w:bookmarkStart w:id="12" w:name="_Toc7021_WPSOffice_Level1"/>
-      <w:bookmarkStart w:id="13" w:name="_Toc26731"/>
-      <w:bookmarkStart w:id="14" w:name="_Toc107825548"/>
+      <w:bookmarkStart w:id="11" w:name="_Toc26731"/>
+      <w:bookmarkStart w:id="12" w:name="_Toc29272"/>
+      <w:bookmarkStart w:id="13" w:name="_Toc11015_WPSOffice_Level1"/>
+      <w:bookmarkStart w:id="14" w:name="_Toc17451"/>
       <w:bookmarkStart w:id="15" w:name="_Toc30767"/>
-      <w:bookmarkStart w:id="16" w:name="_Toc18062_WPSOffice_Level1"/>
-      <w:bookmarkStart w:id="17" w:name="_Toc29272"/>
-      <w:bookmarkStart w:id="18" w:name="_Toc11015_WPSOffice_Level1"/>
+      <w:bookmarkStart w:id="16" w:name="_Toc7021_WPSOffice_Level1"/>
+      <w:bookmarkStart w:id="17" w:name="_Toc107825548"/>
+      <w:bookmarkStart w:id="18" w:name="_Toc18062_WPSOffice_Level1"/>
       <w:bookmarkStart w:id="19" w:name="_Toc3823"/>
       <w:r>
         <w:rPr>
@@ -4371,11 +4371,11 @@
         </w:rPr>
       </w:pPr>
       <w:bookmarkStart w:id="21" w:name="_Toc23369_WPSOffice_Level1"/>
-      <w:bookmarkStart w:id="22" w:name="_Toc16576"/>
-      <w:bookmarkStart w:id="23" w:name="_Toc25920"/>
-      <w:bookmarkStart w:id="24" w:name="_Toc107825549"/>
-      <w:bookmarkStart w:id="25" w:name="_Toc6221_WPSOffice_Level1"/>
-      <w:bookmarkStart w:id="26" w:name="_Toc18058"/>
+      <w:bookmarkStart w:id="22" w:name="_Toc107825549"/>
+      <w:bookmarkStart w:id="23" w:name="_Toc6221_WPSOffice_Level1"/>
+      <w:bookmarkStart w:id="24" w:name="_Toc25920"/>
+      <w:bookmarkStart w:id="25" w:name="_Toc18058"/>
+      <w:bookmarkStart w:id="26" w:name="_Toc16576"/>
       <w:bookmarkStart w:id="27" w:name="_Toc12582"/>
       <w:bookmarkStart w:id="28" w:name="_Toc24089"/>
       <w:r>
@@ -4446,8 +4446,8 @@
           <w:lang w:eastAsia="zh-CN"/>
         </w:rPr>
       </w:pPr>
-      <w:bookmarkStart w:id="29" w:name="_Toc21897"/>
-      <w:bookmarkStart w:id="30" w:name="_Toc149837254"/>
+      <w:bookmarkStart w:id="29" w:name="_Toc149837254"/>
+      <w:bookmarkStart w:id="30" w:name="_Toc21897"/>
       <w:r>
         <w:rPr>
           <w:rFonts w:hint="eastAsia"/>
@@ -4497,12 +4497,6 @@
             <w:insideH w:val="single" w:color="A4A4A4" w:sz="4" w:space="0"/>
             <w:insideV w:val="single" w:color="A4A4A4" w:sz="4" w:space="0"/>
           </w:tblBorders>
-          <w:tblCellMar>
-            <w:top w:w="0" w:type="dxa"/>
-            <w:left w:w="0" w:type="dxa"/>
-            <w:bottom w:w="0" w:type="dxa"/>
-            <w:right w:w="0" w:type="dxa"/>
-          </w:tblCellMar>
         </w:tblPrEx>
         <w:trPr>
           <w:trHeight w:val="490" w:hRule="atLeast"/>
@@ -5569,15 +5563,15 @@
                     <wp:anchor distT="0" distB="0" distL="114300" distR="114300" simplePos="0" relativeHeight="251663360" behindDoc="0" locked="0" layoutInCell="1" allowOverlap="1">
                       <wp:simplePos x="0" y="0"/>
                       <wp:positionH relativeFrom="column">
-                        <wp:posOffset>31115</wp:posOffset>
+                        <wp:posOffset>0</wp:posOffset>
                       </wp:positionH>
                       <wp:positionV relativeFrom="paragraph">
-                        <wp:posOffset>-547370</wp:posOffset>
+                        <wp:posOffset>-460375</wp:posOffset>
                       </wp:positionV>
-                      <wp:extent cx="3160395" cy="1441450"/>
-                      <wp:effectExtent l="0" t="0" r="9525" b="6350"/>
+                      <wp:extent cx="3080385" cy="1442720"/>
+                      <wp:effectExtent l="0" t="0" r="13335" b="5080"/>
                       <wp:wrapNone/>
-                      <wp:docPr id="52" name="组合 52"/>
+                      <wp:docPr id="34" name="组合 34"/>
                       <wp:cNvGraphicFramePr/>
                       <a:graphic xmlns:a="http://schemas.openxmlformats.org/drawingml/2006/main">
                         <a:graphicData uri="http://schemas.microsoft.com/office/word/2010/wordprocessingGroup">
@@ -5586,25 +5580,25 @@
                             <wpg:grpSpPr>
                               <a:xfrm>
                                 <a:off x="0" y="0"/>
-                                <a:ext cx="3160395" cy="1441450"/>
-                                <a:chOff x="10964" y="3809"/>
-                                <a:chExt cx="4977" cy="2270"/>
+                                <a:ext cx="3080385" cy="1442720"/>
+                                <a:chOff x="17956" y="37747"/>
+                                <a:chExt cx="4851" cy="2272"/>
                               </a:xfrm>
                             </wpg:grpSpPr>
                             <wpg:grpSp>
-                              <wpg:cNvPr id="53" name="组合 6"/>
+                              <wpg:cNvPr id="35" name="组合 16"/>
                               <wpg:cNvGrpSpPr/>
                               <wpg:grpSpPr>
                                 <a:xfrm>
-                                  <a:off x="10964" y="4438"/>
-                                  <a:ext cx="4577" cy="734"/>
-                                  <a:chOff x="10964" y="4438"/>
-                                  <a:chExt cx="4577" cy="734"/>
+                                  <a:off x="17956" y="38313"/>
+                                  <a:ext cx="4049" cy="646"/>
+                                  <a:chOff x="17956" y="38313"/>
+                                  <a:chExt cx="4049" cy="646"/>
                                 </a:xfrm>
                               </wpg:grpSpPr>
                               <pic:pic xmlns:pic="http://schemas.openxmlformats.org/drawingml/2006/picture">
                                 <pic:nvPicPr>
-                                  <pic:cNvPr id="7" name="图片 30" descr="微信图片_20220215110121"/>
+                                  <pic:cNvPr id="12" name="图片 29" descr="IMG_256"/>
                                   <pic:cNvPicPr>
                                     <a:picLocks noChangeAspect="1"/>
                                   </pic:cNvPicPr>
@@ -5613,18 +5607,17 @@
                                   <a:blip r:embed="rId11">
                                     <a:clrChange>
                                       <a:clrFrom>
-                                        <a:srgbClr val="A09D98">
+                                        <a:srgbClr val="FFFFFF">
                                           <a:alpha val="100000"/>
                                         </a:srgbClr>
                                       </a:clrFrom>
                                       <a:clrTo>
-                                        <a:srgbClr val="A09D98">
+                                        <a:srgbClr val="FFFFFF">
                                           <a:alpha val="100000"/>
                                           <a:alpha val="0"/>
                                         </a:srgbClr>
                                       </a:clrTo>
                                     </a:clrChange>
-                                    <a:biLevel thresh="50000"/>
                                   </a:blip>
                                   <a:stretch>
                                     <a:fillRect/>
@@ -5632,57 +5625,46 @@
                                 </pic:blipFill>
                                 <pic:spPr>
                                   <a:xfrm>
-                                    <a:off x="10964" y="4458"/>
-                                    <a:ext cx="1234" cy="715"/>
+                                    <a:off x="21031" y="38313"/>
+                                    <a:ext cx="975" cy="570"/>
+                                  </a:xfrm>
+                                  <a:prstGeom prst="rect">
+                                    <a:avLst/>
+                                  </a:prstGeom>
+                                  <a:noFill/>
+                                  <a:ln w="9525">
+                                    <a:noFill/>
+                                  </a:ln>
+                                </pic:spPr>
+                              </pic:pic>
+                              <pic:pic xmlns:pic="http://schemas.openxmlformats.org/drawingml/2006/picture">
+                                <pic:nvPicPr>
+                                  <pic:cNvPr id="15" name="图片 15" descr="c9514d16fd70679bf0495aeebb03c72d_compress"/>
+                                  <pic:cNvPicPr>
+                                    <a:picLocks noChangeAspect="1"/>
+                                  </pic:cNvPicPr>
+                                </pic:nvPicPr>
+                                <pic:blipFill>
+                                  <a:blip r:embed="rId12"/>
+                                  <a:srcRect l="21003" t="56913" r="27176" b="26386"/>
+                                  <a:stretch>
+                                    <a:fillRect/>
+                                  </a:stretch>
+                                </pic:blipFill>
+                                <pic:spPr>
+                                  <a:xfrm>
+                                    <a:off x="17956" y="38485"/>
+                                    <a:ext cx="1550" cy="475"/>
                                   </a:xfrm>
                                   <a:prstGeom prst="rect">
                                     <a:avLst/>
                                   </a:prstGeom>
                                 </pic:spPr>
                               </pic:pic>
-                              <pic:pic xmlns:pic="http://schemas.openxmlformats.org/drawingml/2006/picture">
-                                <pic:nvPicPr>
-                                  <pic:cNvPr id="8" name="图片 34" descr="晓敏"/>
-                                  <pic:cNvPicPr>
-                                    <a:picLocks noChangeAspect="1"/>
-                                  </pic:cNvPicPr>
-                                </pic:nvPicPr>
-                                <pic:blipFill>
-                                  <a:blip r:embed="rId12">
-                                    <a:clrChange>
-                                      <a:clrFrom>
-                                        <a:srgbClr val="949FA1"/>
-                                      </a:clrFrom>
-                                      <a:clrTo>
-                                        <a:srgbClr val="949FA1">
-                                          <a:alpha val="0"/>
-                                        </a:srgbClr>
-                                      </a:clrTo>
-                                    </a:clrChange>
-                                  </a:blip>
-                                  <a:srcRect l="34062" t="26445" r="34097" b="9325"/>
-                                  <a:stretch>
-                                    <a:fillRect/>
-                                  </a:stretch>
-                                </pic:blipFill>
-                                <pic:spPr>
-                                  <a:xfrm rot="16200000">
-                                    <a:off x="14524" y="3981"/>
-                                    <a:ext cx="560" cy="1475"/>
-                                  </a:xfrm>
-                                  <a:prstGeom prst="rect">
-                                    <a:avLst/>
-                                  </a:prstGeom>
-                                  <a:noFill/>
-                                  <a:ln>
-                                    <a:noFill/>
-                                  </a:ln>
-                                </pic:spPr>
-                              </pic:pic>
                             </wpg:grpSp>
                             <pic:pic xmlns:pic="http://schemas.openxmlformats.org/drawingml/2006/picture">
                               <pic:nvPicPr>
-                                <pic:cNvPr id="11" name="图片 8"/>
+                                <pic:cNvPr id="18" name="图片 25"/>
                                 <pic:cNvPicPr>
                                   <a:picLocks noChangeAspect="1" noChangeArrowheads="1"/>
                                 </pic:cNvPicPr>
@@ -5702,8 +5684,8 @@
                               </pic:blipFill>
                               <pic:spPr>
                                 <a:xfrm>
-                                  <a:off x="13671" y="3809"/>
-                                  <a:ext cx="2271" cy="2271"/>
+                                  <a:off x="20535" y="37747"/>
+                                  <a:ext cx="2273" cy="2273"/>
                                 </a:xfrm>
                                 <a:prstGeom prst="rect">
                                   <a:avLst/>
@@ -5722,24 +5704,24 @@
                 </mc:Choice>
                 <mc:Fallback>
                   <w:pict>
-                    <v:group id="_x0000_s1026" o:spid="_x0000_s1026" o:spt="203" style="position:absolute;left:0pt;margin-left:2.45pt;margin-top:-43.1pt;height:113.5pt;width:248.85pt;z-index:251663360;mso-width-relative:page;mso-height-relative:page;" coordorigin="10964,3809" coordsize="4977,2270" o:gfxdata="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">
+                    <v:group id="_x0000_s1026" o:spid="_x0000_s1026" o:spt="203" style="position:absolute;left:0pt;margin-left:0pt;margin-top:-36.25pt;height:113.6pt;width:242.55pt;z-index:251663360;mso-width-relative:page;mso-height-relative:page;" coordorigin="17956,37747" coordsize="4851,2272" o:gfxdata="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">
                       <o:lock v:ext="edit" aspectratio="f"/>
-                      <v:group id="组合 6" o:spid="_x0000_s1026" o:spt="203" style="position:absolute;left:10964;top:4438;height:734;width:4577;" coordorigin="10964,4438" coordsize="4577,734" o:gfxdata="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">
+                      <v:group id="组合 16" o:spid="_x0000_s1026" o:spt="203" style="position:absolute;left:17956;top:38313;height:646;width:4049;" coordorigin="17956,38313" coordsize="4049,646" o:gfxdata="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">
                         <o:lock v:ext="edit" aspectratio="f"/>
-                        <v:shape id="图片 30" o:spid="_x0000_s1026" o:spt="75" alt="微信图片_20220215110121" type="#_x0000_t75" style="position:absolute;left:10964;top:4458;height:715;width:1234;" filled="f" o:preferrelative="t" stroked="f" coordsize="21600,21600" o:gfxdata="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">
+                        <v:shape id="图片 29" o:spid="_x0000_s1026" o:spt="75" alt="IMG_256" type="#_x0000_t75" style="position:absolute;left:21031;top:38313;height:570;width:975;" filled="f" o:preferrelative="t" stroked="f" coordsize="21600,21600" o:gfxdata="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">
                           <v:fill on="f" focussize="0,0"/>
                           <v:stroke on="f"/>
-                          <v:imagedata r:id="rId11" grayscale="t" bilevel="t" chromakey="#A09D98" o:title=""/>
+                          <v:imagedata r:id="rId11" chromakey="#FFFFFF" o:title=""/>
                           <o:lock v:ext="edit" aspectratio="t"/>
                         </v:shape>
-                        <v:shape id="图片 34" o:spid="_x0000_s1026" o:spt="75" alt="晓敏" type="#_x0000_t75" style="position:absolute;left:14524;top:3981;height:1475;width:560;rotation:-5898240f;" filled="f" o:preferrelative="t" stroked="f" coordsize="21600,21600" o:gfxdata="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">
+                        <v:shape id="_x0000_s1026" o:spid="_x0000_s1026" o:spt="75" alt="c9514d16fd70679bf0495aeebb03c72d_compress" type="#_x0000_t75" style="position:absolute;left:17956;top:38485;height:475;width:1550;" filled="f" o:preferrelative="t" stroked="f" coordsize="21600,21600" o:gfxdata="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">
                           <v:fill on="f" focussize="0,0"/>
                           <v:stroke on="f"/>
-                          <v:imagedata r:id="rId12" cropleft="22323f" croptop="17331f" cropright="22346f" cropbottom="6111f" chromakey="#949FA1" o:title=""/>
+                          <v:imagedata r:id="rId12" cropleft="13765f" croptop="37299f" cropright="17810f" cropbottom="17292f" o:title=""/>
                           <o:lock v:ext="edit" aspectratio="t"/>
                         </v:shape>
                       </v:group>
-                      <v:shape id="图片 8" o:spid="_x0000_s1026" o:spt="75" type="#_x0000_t75" style="position:absolute;left:13671;top:3809;height:2271;width:2271;" filled="f" o:preferrelative="t" stroked="f" coordsize="21600,21600" o:gfxdata="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">
+                      <v:shape id="图片 25" o:spid="_x0000_s1026" o:spt="75" type="#_x0000_t75" style="position:absolute;left:20535;top:37747;height:2273;width:2273;" filled="f" o:preferrelative="t" stroked="f" coordsize="21600,21600" o:gfxdata="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">
                         <v:fill on="f" focussize="0,0"/>
                         <v:stroke on="f"/>
                         <v:imagedata r:id="rId13" o:title=""/>
@@ -6036,8 +6018,9 @@
     <w:p>
       <w:pPr>
         <w:rPr>
+          <w:rFonts w:hint="default"/>
           <w:sz w:val="24"/>
-          <w:lang w:eastAsia="zh-CN"/>
+          <w:lang w:val="en-US" w:eastAsia="zh-CN"/>
         </w:rPr>
       </w:pPr>
     </w:p>
@@ -6137,15 +6120,15 @@
                     <wp:anchor distT="0" distB="0" distL="114300" distR="114300" simplePos="0" relativeHeight="251664384" behindDoc="0" locked="0" layoutInCell="1" allowOverlap="1">
                       <wp:simplePos x="0" y="0"/>
                       <wp:positionH relativeFrom="column">
-                        <wp:posOffset>-8255</wp:posOffset>
+                        <wp:posOffset>0</wp:posOffset>
                       </wp:positionH>
                       <wp:positionV relativeFrom="paragraph">
-                        <wp:posOffset>-472440</wp:posOffset>
+                        <wp:posOffset>-490855</wp:posOffset>
                       </wp:positionV>
-                      <wp:extent cx="3210560" cy="1443355"/>
-                      <wp:effectExtent l="0" t="0" r="5080" b="4445"/>
+                      <wp:extent cx="3135630" cy="1442720"/>
+                      <wp:effectExtent l="0" t="0" r="3810" b="5080"/>
                       <wp:wrapNone/>
-                      <wp:docPr id="55" name="组合 55"/>
+                      <wp:docPr id="36" name="组合 36"/>
                       <wp:cNvGraphicFramePr/>
                       <a:graphic xmlns:a="http://schemas.openxmlformats.org/drawingml/2006/main">
                         <a:graphicData uri="http://schemas.microsoft.com/office/word/2010/wordprocessingGroup">
@@ -6154,64 +6137,49 @@
                             <wpg:grpSpPr>
                               <a:xfrm>
                                 <a:off x="0" y="0"/>
-                                <a:ext cx="3210560" cy="1443355"/>
-                                <a:chOff x="7101" y="5724"/>
-                                <a:chExt cx="5056" cy="2273"/>
+                                <a:ext cx="3135630" cy="1442720"/>
+                                <a:chOff x="17956" y="39496"/>
+                                <a:chExt cx="4938" cy="2272"/>
                               </a:xfrm>
                             </wpg:grpSpPr>
                             <wpg:grpSp>
-                              <wpg:cNvPr id="56" name="组合 1"/>
+                              <wpg:cNvPr id="37" name="组合 30"/>
                               <wpg:cNvGrpSpPr/>
                               <wpg:grpSpPr>
                                 <a:xfrm>
-                                  <a:off x="7101" y="6197"/>
-                                  <a:ext cx="4377" cy="714"/>
-                                  <a:chOff x="7101" y="6197"/>
-                                  <a:chExt cx="4377" cy="714"/>
+                                  <a:off x="17956" y="40098"/>
+                                  <a:ext cx="4213" cy="570"/>
+                                  <a:chOff x="17956" y="40098"/>
+                                  <a:chExt cx="4213" cy="570"/>
                                 </a:xfrm>
                               </wpg:grpSpPr>
                               <pic:pic xmlns:pic="http://schemas.openxmlformats.org/drawingml/2006/picture">
                                 <pic:nvPicPr>
-                                  <pic:cNvPr id="59" name="图片 34" descr="晓敏"/>
+                                  <pic:cNvPr id="6" name="图片 1" descr="24f613a0-66be-430b-9e80-270d3393fac5"/>
                                   <pic:cNvPicPr>
                                     <a:picLocks noChangeAspect="1"/>
                                   </pic:cNvPicPr>
                                 </pic:nvPicPr>
                                 <pic:blipFill>
-                                  <a:blip r:embed="rId12">
-                                    <a:clrChange>
-                                      <a:clrFrom>
-                                        <a:srgbClr val="949FA1"/>
-                                      </a:clrFrom>
-                                      <a:clrTo>
-                                        <a:srgbClr val="949FA1">
-                                          <a:alpha val="0"/>
-                                        </a:srgbClr>
-                                      </a:clrTo>
-                                    </a:clrChange>
-                                  </a:blip>
-                                  <a:srcRect l="34062" t="26445" r="34097" b="9325"/>
+                                  <a:blip r:embed="rId14"/>
+                                  <a:srcRect l="43292" t="26660" r="21693" b="24394"/>
                                   <a:stretch>
                                     <a:fillRect/>
                                   </a:stretch>
                                 </pic:blipFill>
                                 <pic:spPr>
                                   <a:xfrm rot="16200000">
-                                    <a:off x="7558" y="5850"/>
-                                    <a:ext cx="560" cy="1475"/>
+                                    <a:off x="18366" y="39740"/>
+                                    <a:ext cx="506" cy="1327"/>
                                   </a:xfrm>
                                   <a:prstGeom prst="rect">
                                     <a:avLst/>
                                   </a:prstGeom>
-                                  <a:noFill/>
-                                  <a:ln>
-                                    <a:noFill/>
-                                  </a:ln>
                                 </pic:spPr>
                               </pic:pic>
                               <pic:pic xmlns:pic="http://schemas.openxmlformats.org/drawingml/2006/picture">
                                 <pic:nvPicPr>
-                                  <pic:cNvPr id="45" name="图片 45" descr="微信图片_20220215110121"/>
+                                  <pic:cNvPr id="29" name="图片 29" descr="IMG_256"/>
                                   <pic:cNvPicPr>
                                     <a:picLocks noChangeAspect="1"/>
                                   </pic:cNvPicPr>
@@ -6220,18 +6188,17 @@
                                   <a:blip r:embed="rId11">
                                     <a:clrChange>
                                       <a:clrFrom>
-                                        <a:srgbClr val="A09D98">
+                                        <a:srgbClr val="FFFFFF">
                                           <a:alpha val="100000"/>
                                         </a:srgbClr>
                                       </a:clrFrom>
                                       <a:clrTo>
-                                        <a:srgbClr val="A09D98">
+                                        <a:srgbClr val="FFFFFF">
                                           <a:alpha val="100000"/>
                                           <a:alpha val="0"/>
                                         </a:srgbClr>
                                       </a:clrTo>
                                     </a:clrChange>
-                                    <a:biLevel thresh="50000"/>
                                   </a:blip>
                                   <a:stretch>
                                     <a:fillRect/>
@@ -6239,18 +6206,22 @@
                                 </pic:blipFill>
                                 <pic:spPr>
                                   <a:xfrm>
-                                    <a:off x="10244" y="6197"/>
-                                    <a:ext cx="1234" cy="715"/>
+                                    <a:off x="21195" y="40098"/>
+                                    <a:ext cx="975" cy="570"/>
                                   </a:xfrm>
                                   <a:prstGeom prst="rect">
                                     <a:avLst/>
                                   </a:prstGeom>
+                                  <a:noFill/>
+                                  <a:ln w="9525">
+                                    <a:noFill/>
+                                  </a:ln>
                                 </pic:spPr>
                               </pic:pic>
                             </wpg:grpSp>
                             <pic:pic xmlns:pic="http://schemas.openxmlformats.org/drawingml/2006/picture">
                               <pic:nvPicPr>
-                                <pic:cNvPr id="32" name="图片 4"/>
+                                <pic:cNvPr id="31" name="图片 25"/>
                                 <pic:cNvPicPr>
                                   <a:picLocks noChangeAspect="1" noChangeArrowheads="1"/>
                                 </pic:cNvPicPr>
@@ -6270,7 +6241,7 @@
                               </pic:blipFill>
                               <pic:spPr>
                                 <a:xfrm>
-                                  <a:off x="9884" y="5724"/>
+                                  <a:off x="20622" y="39496"/>
                                   <a:ext cx="2273" cy="2273"/>
                                 </a:xfrm>
                                 <a:prstGeom prst="rect">
@@ -6290,24 +6261,24 @@
                 </mc:Choice>
                 <mc:Fallback>
                   <w:pict>
-                    <v:group id="_x0000_s1026" o:spid="_x0000_s1026" o:spt="203" style="position:absolute;left:0pt;margin-left:-0.65pt;margin-top:-37.2pt;height:113.65pt;width:252.8pt;z-index:251664384;mso-width-relative:page;mso-height-relative:page;" coordorigin="7101,5724" coordsize="5056,2273" o:gfxdata="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">
+                    <v:group id="_x0000_s1026" o:spid="_x0000_s1026" o:spt="203" style="position:absolute;left:0pt;margin-left:0pt;margin-top:-38.65pt;height:113.6pt;width:246.9pt;z-index:251664384;mso-width-relative:page;mso-height-relative:page;" coordorigin="17956,39496" coordsize="4938,2272" o:gfxdata="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">
                       <o:lock v:ext="edit" aspectratio="f"/>
-                      <v:group id="组合 1" o:spid="_x0000_s1026" o:spt="203" style="position:absolute;left:7101;top:6197;height:714;width:4377;" coordorigin="7101,6197" coordsize="4377,714" o:gfxdata="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">
+                      <v:group id="组合 30" o:spid="_x0000_s1026" o:spt="203" style="position:absolute;left:17956;top:40098;height:570;width:4213;" coordorigin="17956,40098" coordsize="4213,570" o:gfxdata="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">
                         <o:lock v:ext="edit" aspectratio="f"/>
-                        <v:shape id="图片 34" o:spid="_x0000_s1026" o:spt="75" alt="晓敏" type="#_x0000_t75" style="position:absolute;left:7558;top:5850;height:1475;width:560;rotation:-5898240f;" filled="f" o:preferrelative="t" stroked="f" coordsize="21600,21600" o:gfxdata="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">
+                        <v:shape id="图片 1" o:spid="_x0000_s1026" o:spt="75" alt="24f613a0-66be-430b-9e80-270d3393fac5" type="#_x0000_t75" style="position:absolute;left:18366;top:39740;height:1327;width:506;rotation:-5898240f;" filled="f" o:preferrelative="t" stroked="f" coordsize="21600,21600" o:gfxdata="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">
                           <v:fill on="f" focussize="0,0"/>
                           <v:stroke on="f"/>
-                          <v:imagedata r:id="rId12" cropleft="22323f" croptop="17331f" cropright="22346f" cropbottom="6111f" chromakey="#949FA1" o:title=""/>
+                          <v:imagedata r:id="rId14" cropleft="28372f" croptop="17472f" cropright="14217f" cropbottom="15987f" o:title=""/>
                           <o:lock v:ext="edit" aspectratio="t"/>
                         </v:shape>
-                        <v:shape id="_x0000_s1026" o:spid="_x0000_s1026" o:spt="75" alt="微信图片_20220215110121" type="#_x0000_t75" style="position:absolute;left:10244;top:6197;height:715;width:1234;" filled="f" o:preferrelative="t" stroked="f" coordsize="21600,21600" o:gfxdata="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">
+                        <v:shape id="_x0000_s1026" o:spid="_x0000_s1026" o:spt="75" alt="IMG_256" type="#_x0000_t75" style="position:absolute;left:21195;top:40098;height:570;width:975;" filled="f" o:preferrelative="t" stroked="f" coordsize="21600,21600" o:gfxdata="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">
                           <v:fill on="f" focussize="0,0"/>
                           <v:stroke on="f"/>
-                          <v:imagedata r:id="rId11" grayscale="t" bilevel="t" chromakey="#A09D98" o:title=""/>
+                          <v:imagedata r:id="rId11" chromakey="#FFFFFF" o:title=""/>
                           <o:lock v:ext="edit" aspectratio="t"/>
                         </v:shape>
                       </v:group>
-                      <v:shape id="图片 4" o:spid="_x0000_s1026" o:spt="75" type="#_x0000_t75" style="position:absolute;left:9884;top:5724;height:2273;width:2273;" filled="f" o:preferrelative="t" stroked="f" coordsize="21600,21600" o:gfxdata="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">
+                      <v:shape id="图片 25" o:spid="_x0000_s1026" o:spt="75" type="#_x0000_t75" style="position:absolute;left:20622;top:39496;height:2273;width:2273;" filled="f" o:preferrelative="t" stroked="f" coordsize="21600,21600" o:gfxdata="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">
                         <v:fill on="f" focussize="0,0"/>
                         <v:stroke on="f"/>
                         <v:imagedata r:id="rId13" o:title=""/>
@@ -6699,7 +6670,7 @@
             </w:pPr>
             <w:r>
               <w:rPr>
-                <w:sz w:val="22"/>
+                <w:sz w:val="24"/>
               </w:rPr>
               <mc:AlternateContent>
                 <mc:Choice Requires="wpg">
@@ -6707,15 +6678,15 @@
                     <wp:anchor distT="0" distB="0" distL="114300" distR="114300" simplePos="0" relativeHeight="251665408" behindDoc="0" locked="0" layoutInCell="1" allowOverlap="1">
                       <wp:simplePos x="0" y="0"/>
                       <wp:positionH relativeFrom="column">
-                        <wp:posOffset>-17780</wp:posOffset>
+                        <wp:posOffset>-59690</wp:posOffset>
                       </wp:positionH>
                       <wp:positionV relativeFrom="paragraph">
-                        <wp:posOffset>-485775</wp:posOffset>
+                        <wp:posOffset>-527685</wp:posOffset>
                       </wp:positionV>
-                      <wp:extent cx="3196590" cy="1442720"/>
-                      <wp:effectExtent l="0" t="0" r="3810" b="5080"/>
+                      <wp:extent cx="3114040" cy="1442720"/>
+                      <wp:effectExtent l="0" t="0" r="10160" b="5080"/>
                       <wp:wrapNone/>
-                      <wp:docPr id="66" name="组合 66"/>
+                      <wp:docPr id="38" name="组合 38"/>
                       <wp:cNvGraphicFramePr/>
                       <a:graphic xmlns:a="http://schemas.openxmlformats.org/drawingml/2006/main">
                         <a:graphicData uri="http://schemas.microsoft.com/office/word/2010/wordprocessingGroup">
@@ -6724,91 +6695,14 @@
                             <wpg:grpSpPr>
                               <a:xfrm>
                                 <a:off x="0" y="0"/>
-                                <a:ext cx="3196590" cy="1442720"/>
-                                <a:chOff x="19087" y="960"/>
-                                <a:chExt cx="5034" cy="2272"/>
+                                <a:ext cx="3114040" cy="1442720"/>
+                                <a:chOff x="17862" y="41199"/>
+                                <a:chExt cx="4904" cy="2272"/>
                               </a:xfrm>
                             </wpg:grpSpPr>
-                            <wpg:grpSp>
-                              <wpg:cNvPr id="67" name="组合 15"/>
-                              <wpg:cNvGrpSpPr/>
-                              <wpg:grpSpPr>
-                                <a:xfrm rot="0">
-                                  <a:off x="19087" y="1459"/>
-                                  <a:ext cx="4523" cy="714"/>
-                                  <a:chOff x="12357" y="7666"/>
-                                  <a:chExt cx="4523" cy="714"/>
-                                </a:xfrm>
-                              </wpg:grpSpPr>
-                              <pic:pic xmlns:pic="http://schemas.openxmlformats.org/drawingml/2006/picture">
-                                <pic:nvPicPr>
-                                  <pic:cNvPr id="18" name="图片 59" descr="图片1"/>
-                                  <pic:cNvPicPr>
-                                    <a:picLocks noChangeAspect="1"/>
-                                  </pic:cNvPicPr>
-                                </pic:nvPicPr>
-                                <pic:blipFill>
-                                  <a:blip r:embed="rId14">
-                                    <a:biLevel thresh="50000"/>
-                                  </a:blip>
-                                  <a:srcRect l="7865" t="11797" r="5322" b="19074"/>
-                                  <a:stretch>
-                                    <a:fillRect/>
-                                  </a:stretch>
-                                </pic:blipFill>
-                                <pic:spPr>
-                                  <a:xfrm>
-                                    <a:off x="12357" y="7738"/>
-                                    <a:ext cx="1468" cy="627"/>
-                                  </a:xfrm>
-                                  <a:prstGeom prst="rect">
-                                    <a:avLst/>
-                                  </a:prstGeom>
-                                  <a:noFill/>
-                                </pic:spPr>
-                              </pic:pic>
-                              <pic:pic xmlns:pic="http://schemas.openxmlformats.org/drawingml/2006/picture">
-                                <pic:nvPicPr>
-                                  <pic:cNvPr id="23" name="图片 14" descr="微信图片_20220215110121"/>
-                                  <pic:cNvPicPr>
-                                    <a:picLocks noChangeAspect="1"/>
-                                  </pic:cNvPicPr>
-                                </pic:nvPicPr>
-                                <pic:blipFill>
-                                  <a:blip r:embed="rId11">
-                                    <a:clrChange>
-                                      <a:clrFrom>
-                                        <a:srgbClr val="A09D98">
-                                          <a:alpha val="100000"/>
-                                        </a:srgbClr>
-                                      </a:clrFrom>
-                                      <a:clrTo>
-                                        <a:srgbClr val="A09D98">
-                                          <a:alpha val="100000"/>
-                                          <a:alpha val="0"/>
-                                        </a:srgbClr>
-                                      </a:clrTo>
-                                    </a:clrChange>
-                                    <a:biLevel thresh="50000"/>
-                                  </a:blip>
-                                  <a:stretch>
-                                    <a:fillRect/>
-                                  </a:stretch>
-                                </pic:blipFill>
-                                <pic:spPr>
-                                  <a:xfrm>
-                                    <a:off x="15646" y="7666"/>
-                                    <a:ext cx="1234" cy="715"/>
-                                  </a:xfrm>
-                                  <a:prstGeom prst="rect">
-                                    <a:avLst/>
-                                  </a:prstGeom>
-                                </pic:spPr>
-                              </pic:pic>
-                            </wpg:grpSp>
                             <pic:pic xmlns:pic="http://schemas.openxmlformats.org/drawingml/2006/picture">
                               <pic:nvPicPr>
-                                <pic:cNvPr id="12" name="图片 23"/>
+                                <pic:cNvPr id="7" name="图片 23"/>
                                 <pic:cNvPicPr>
                                   <a:picLocks noChangeAspect="1" noChangeArrowheads="1"/>
                                 </pic:cNvPicPr>
@@ -6828,7 +6722,7 @@
                               </pic:blipFill>
                               <pic:spPr>
                                 <a:xfrm>
-                                  <a:off x="21849" y="960"/>
+                                  <a:off x="20494" y="41199"/>
                                   <a:ext cx="2273" cy="2273"/>
                                 </a:xfrm>
                                 <a:prstGeom prst="rect">
@@ -6840,6 +6734,86 @@
                                 </a:ln>
                               </pic:spPr>
                             </pic:pic>
+                            <wpg:grpSp>
+                              <wpg:cNvPr id="39" name="组合 23"/>
+                              <wpg:cNvGrpSpPr/>
+                              <wpg:grpSpPr>
+                                <a:xfrm>
+                                  <a:off x="17862" y="41843"/>
+                                  <a:ext cx="4208" cy="652"/>
+                                  <a:chOff x="17862" y="41843"/>
+                                  <a:chExt cx="4208" cy="652"/>
+                                </a:xfrm>
+                              </wpg:grpSpPr>
+                              <pic:pic xmlns:pic="http://schemas.openxmlformats.org/drawingml/2006/picture">
+                                <pic:nvPicPr>
+                                  <pic:cNvPr id="22" name="图片 59" descr="图片1"/>
+                                  <pic:cNvPicPr>
+                                    <a:picLocks noChangeAspect="1"/>
+                                  </pic:cNvPicPr>
+                                </pic:nvPicPr>
+                                <pic:blipFill>
+                                  <a:blip r:embed="rId15">
+                                    <a:biLevel thresh="50000"/>
+                                  </a:blip>
+                                  <a:srcRect l="7865" t="11797" r="5322" b="19074"/>
+                                  <a:stretch>
+                                    <a:fillRect/>
+                                  </a:stretch>
+                                </pic:blipFill>
+                                <pic:spPr>
+                                  <a:xfrm>
+                                    <a:off x="17862" y="41869"/>
+                                    <a:ext cx="1468" cy="627"/>
+                                  </a:xfrm>
+                                  <a:prstGeom prst="rect">
+                                    <a:avLst/>
+                                  </a:prstGeom>
+                                  <a:noFill/>
+                                </pic:spPr>
+                              </pic:pic>
+                              <pic:pic xmlns:pic="http://schemas.openxmlformats.org/drawingml/2006/picture">
+                                <pic:nvPicPr>
+                                  <pic:cNvPr id="21" name="图片 29" descr="IMG_256"/>
+                                  <pic:cNvPicPr>
+                                    <a:picLocks noChangeAspect="1"/>
+                                  </pic:cNvPicPr>
+                                </pic:nvPicPr>
+                                <pic:blipFill>
+                                  <a:blip r:embed="rId11">
+                                    <a:clrChange>
+                                      <a:clrFrom>
+                                        <a:srgbClr val="FFFFFF">
+                                          <a:alpha val="100000"/>
+                                        </a:srgbClr>
+                                      </a:clrFrom>
+                                      <a:clrTo>
+                                        <a:srgbClr val="FFFFFF">
+                                          <a:alpha val="100000"/>
+                                          <a:alpha val="0"/>
+                                        </a:srgbClr>
+                                      </a:clrTo>
+                                    </a:clrChange>
+                                  </a:blip>
+                                  <a:stretch>
+                                    <a:fillRect/>
+                                  </a:stretch>
+                                </pic:blipFill>
+                                <pic:spPr>
+                                  <a:xfrm>
+                                    <a:off x="21096" y="41843"/>
+                                    <a:ext cx="975" cy="570"/>
+                                  </a:xfrm>
+                                  <a:prstGeom prst="rect">
+                                    <a:avLst/>
+                                  </a:prstGeom>
+                                  <a:noFill/>
+                                  <a:ln w="9525">
+                                    <a:noFill/>
+                                  </a:ln>
+                                </pic:spPr>
+                              </pic:pic>
+                            </wpg:grpSp>
                           </wpg:wgp>
                         </a:graphicData>
                       </a:graphic>
@@ -6848,29 +6822,29 @@
                 </mc:Choice>
                 <mc:Fallback>
                   <w:pict>
-                    <v:group id="_x0000_s1026" o:spid="_x0000_s1026" o:spt="203" style="position:absolute;left:0pt;margin-left:-1.4pt;margin-top:-38.25pt;height:113.6pt;width:251.7pt;z-index:251665408;mso-width-relative:page;mso-height-relative:page;" coordorigin="19087,960" coordsize="5034,2272" o:gfxdata="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">
+                    <v:group id="_x0000_s1026" o:spid="_x0000_s1026" o:spt="203" style="position:absolute;left:0pt;margin-left:-4.7pt;margin-top:-41.55pt;height:113.6pt;width:245.2pt;z-index:251665408;mso-width-relative:page;mso-height-relative:page;" coordorigin="17862,41199" coordsize="4904,2272" o:gfxdata="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">
                       <o:lock v:ext="edit" aspectratio="f"/>
-                      <v:group id="组合 15" o:spid="_x0000_s1026" o:spt="203" style="position:absolute;left:19087;top:1459;height:714;width:4523;" coordorigin="12357,7666" coordsize="4523,714" o:gfxdata="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">
-                        <o:lock v:ext="edit" aspectratio="f"/>
-                        <v:shape id="图片 59" o:spid="_x0000_s1026" o:spt="75" alt="图片1" type="#_x0000_t75" style="position:absolute;left:12357;top:7738;height:627;width:1468;" filled="f" o:preferrelative="t" stroked="f" coordsize="21600,21600" o:gfxdata="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">
-                          <v:fill on="f" focussize="0,0"/>
-                          <v:stroke on="f"/>
-                          <v:imagedata r:id="rId14" cropleft="5154f" croptop="7731f" cropright="3488f" cropbottom="12500f" grayscale="t" bilevel="t" o:title=""/>
-                          <o:lock v:ext="edit" aspectratio="t"/>
-                        </v:shape>
-                        <v:shape id="图片 14" o:spid="_x0000_s1026" o:spt="75" alt="微信图片_20220215110121" type="#_x0000_t75" style="position:absolute;left:15646;top:7666;height:715;width:1234;" filled="f" o:preferrelative="t" stroked="f" coordsize="21600,21600" o:gfxdata="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">
-                          <v:fill on="f" focussize="0,0"/>
-                          <v:stroke on="f"/>
-                          <v:imagedata r:id="rId11" grayscale="t" bilevel="t" chromakey="#A09D98" o:title=""/>
-                          <o:lock v:ext="edit" aspectratio="t"/>
-                        </v:shape>
-                      </v:group>
-                      <v:shape id="图片 23" o:spid="_x0000_s1026" o:spt="75" type="#_x0000_t75" style="position:absolute;left:21849;top:960;height:2273;width:2273;" filled="f" o:preferrelative="t" stroked="f" coordsize="21600,21600" o:gfxdata="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">
+                      <v:shape id="图片 23" o:spid="_x0000_s1026" o:spt="75" type="#_x0000_t75" style="position:absolute;left:20494;top:41199;height:2273;width:2273;" filled="f" o:preferrelative="t" stroked="f" coordsize="21600,21600" o:gfxdata="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">
                         <v:fill on="f" focussize="0,0"/>
                         <v:stroke on="f"/>
                         <v:imagedata r:id="rId13" o:title=""/>
                         <o:lock v:ext="edit" aspectratio="t"/>
                       </v:shape>
+                      <v:group id="组合 23" o:spid="_x0000_s1026" o:spt="203" style="position:absolute;left:17862;top:41843;height:652;width:4208;" coordorigin="17862,41843" coordsize="4208,652" o:gfxdata="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">
+                        <o:lock v:ext="edit" aspectratio="f"/>
+                        <v:shape id="图片 59" o:spid="_x0000_s1026" o:spt="75" alt="图片1" type="#_x0000_t75" style="position:absolute;left:17862;top:41869;height:627;width:1468;" filled="f" o:preferrelative="t" stroked="f" coordsize="21600,21600" o:gfxdata="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">
+                          <v:fill on="f" focussize="0,0"/>
+                          <v:stroke on="f"/>
+                          <v:imagedata r:id="rId15" cropleft="5154f" croptop="7731f" cropright="3488f" cropbottom="12500f" grayscale="t" bilevel="t" o:title=""/>
+                          <o:lock v:ext="edit" aspectratio="t"/>
+                        </v:shape>
+                        <v:shape id="图片 29" o:spid="_x0000_s1026" o:spt="75" alt="IMG_256" type="#_x0000_t75" style="position:absolute;left:21096;top:41843;height:570;width:975;" filled="f" o:preferrelative="t" stroked="f" coordsize="21600,21600" o:gfxdata="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">
+                          <v:fill on="f" focussize="0,0"/>
+                          <v:stroke on="f"/>
+                          <v:imagedata r:id="rId11" chromakey="#FFFFFF" o:title=""/>
+                          <o:lock v:ext="edit" aspectratio="t"/>
+                        </v:shape>
+                      </v:group>
                     </v:group>
                   </w:pict>
                 </mc:Fallback>
@@ -7259,7 +7233,7 @@
             </w:pPr>
             <w:r>
               <w:rPr>
-                <w:sz w:val="22"/>
+                <w:sz w:val="24"/>
               </w:rPr>
               <mc:AlternateContent>
                 <mc:Choice Requires="wpg">
@@ -7272,10 +7246,10 @@
                       <wp:positionV relativeFrom="paragraph">
                         <wp:posOffset>-514985</wp:posOffset>
                       </wp:positionV>
-                      <wp:extent cx="3143250" cy="1442720"/>
-                      <wp:effectExtent l="0" t="0" r="11430" b="5080"/>
+                      <wp:extent cx="3150235" cy="1442720"/>
+                      <wp:effectExtent l="0" t="0" r="4445" b="5080"/>
                       <wp:wrapNone/>
-                      <wp:docPr id="68" name="组合 68"/>
+                      <wp:docPr id="8" name="组合 8"/>
                       <wp:cNvGraphicFramePr/>
                       <a:graphic xmlns:a="http://schemas.openxmlformats.org/drawingml/2006/main">
                         <a:graphicData uri="http://schemas.microsoft.com/office/word/2010/wordprocessingGroup">
@@ -7284,31 +7258,65 @@
                             <wpg:grpSpPr>
                               <a:xfrm>
                                 <a:off x="0" y="0"/>
-                                <a:ext cx="3143250" cy="1442720"/>
-                                <a:chOff x="19315" y="2640"/>
-                                <a:chExt cx="4950" cy="2272"/>
+                                <a:ext cx="3150235" cy="1442720"/>
+                                <a:chOff x="17976" y="42945"/>
+                                <a:chExt cx="4961" cy="2272"/>
                               </a:xfrm>
                             </wpg:grpSpPr>
+                            <pic:pic xmlns:pic="http://schemas.openxmlformats.org/drawingml/2006/picture">
+                              <pic:nvPicPr>
+                                <pic:cNvPr id="11" name="图片 25"/>
+                                <pic:cNvPicPr>
+                                  <a:picLocks noChangeAspect="1" noChangeArrowheads="1"/>
+                                </pic:cNvPicPr>
+                              </pic:nvPicPr>
+                              <pic:blipFill>
+                                <a:blip r:embed="rId13">
+                                  <a:extLst>
+                                    <a:ext uri="{28A0092B-C50C-407E-A947-70E740481C1C}">
+                                      <a14:useLocalDpi xmlns:a14="http://schemas.microsoft.com/office/drawing/2010/main" val="0"/>
+                                    </a:ext>
+                                  </a:extLst>
+                                </a:blip>
+                                <a:srcRect/>
+                                <a:stretch>
+                                  <a:fillRect/>
+                                </a:stretch>
+                              </pic:blipFill>
+                              <pic:spPr>
+                                <a:xfrm>
+                                  <a:off x="20665" y="42945"/>
+                                  <a:ext cx="2273" cy="2273"/>
+                                </a:xfrm>
+                                <a:prstGeom prst="rect">
+                                  <a:avLst/>
+                                </a:prstGeom>
+                                <a:noFill/>
+                                <a:ln>
+                                  <a:noFill/>
+                                </a:ln>
+                              </pic:spPr>
+                            </pic:pic>
                             <wpg:grpSp>
-                              <wpg:cNvPr id="73" name="组合 22"/>
+                              <wpg:cNvPr id="41" name="组合 27"/>
                               <wpg:cNvGrpSpPr/>
                               <wpg:grpSpPr>
-                                <a:xfrm rot="0">
-                                  <a:off x="19315" y="3174"/>
-                                  <a:ext cx="4415" cy="714"/>
-                                  <a:chOff x="12525" y="9562"/>
-                                  <a:chExt cx="4415" cy="714"/>
+                                <a:xfrm>
+                                  <a:off x="17976" y="43614"/>
+                                  <a:ext cx="4551" cy="626"/>
+                                  <a:chOff x="17976" y="43614"/>
+                                  <a:chExt cx="4551" cy="626"/>
                                 </a:xfrm>
                               </wpg:grpSpPr>
                               <pic:pic xmlns:pic="http://schemas.openxmlformats.org/drawingml/2006/picture">
                                 <pic:nvPicPr>
-                                  <pic:cNvPr id="19" name="图片 29" descr="IMG_256"/>
+                                  <pic:cNvPr id="14" name="图片 29" descr="IMG_256"/>
                                   <pic:cNvPicPr>
                                     <a:picLocks noChangeAspect="1"/>
                                   </pic:cNvPicPr>
                                 </pic:nvPicPr>
                                 <pic:blipFill>
-                                  <a:blip r:embed="rId15">
+                                  <a:blip r:embed="rId11">
                                     <a:clrChange>
                                       <a:clrFrom>
                                         <a:srgbClr val="FFFFFF">
@@ -7329,7 +7337,7 @@
                                 </pic:blipFill>
                                 <pic:spPr>
                                   <a:xfrm>
-                                    <a:off x="12525" y="9698"/>
+                                    <a:off x="17976" y="43615"/>
                                     <a:ext cx="975" cy="570"/>
                                   </a:xfrm>
                                   <a:prstGeom prst="rect">
@@ -7343,77 +7351,32 @@
                               </pic:pic>
                               <pic:pic xmlns:pic="http://schemas.openxmlformats.org/drawingml/2006/picture">
                                 <pic:nvPicPr>
-                                  <pic:cNvPr id="20" name="图片 20" descr="微信图片_20220215110121"/>
+                                  <pic:cNvPr id="16" name="图片 59" descr="图片1"/>
                                   <pic:cNvPicPr>
                                     <a:picLocks noChangeAspect="1"/>
                                   </pic:cNvPicPr>
                                 </pic:nvPicPr>
                                 <pic:blipFill>
-                                  <a:blip r:embed="rId11">
-                                    <a:clrChange>
-                                      <a:clrFrom>
-                                        <a:srgbClr val="A09D98">
-                                          <a:alpha val="100000"/>
-                                        </a:srgbClr>
-                                      </a:clrFrom>
-                                      <a:clrTo>
-                                        <a:srgbClr val="A09D98">
-                                          <a:alpha val="100000"/>
-                                          <a:alpha val="0"/>
-                                        </a:srgbClr>
-                                      </a:clrTo>
-                                    </a:clrChange>
+                                  <a:blip r:embed="rId15">
                                     <a:biLevel thresh="50000"/>
                                   </a:blip>
+                                  <a:srcRect l="7865" t="11797" r="5322" b="19074"/>
                                   <a:stretch>
                                     <a:fillRect/>
                                   </a:stretch>
                                 </pic:blipFill>
                                 <pic:spPr>
                                   <a:xfrm>
-                                    <a:off x="15706" y="9562"/>
-                                    <a:ext cx="1234" cy="715"/>
+                                    <a:off x="21059" y="43614"/>
+                                    <a:ext cx="1468" cy="627"/>
                                   </a:xfrm>
                                   <a:prstGeom prst="rect">
                                     <a:avLst/>
                                   </a:prstGeom>
+                                  <a:noFill/>
                                 </pic:spPr>
                               </pic:pic>
                             </wpg:grpSp>
-                            <pic:pic xmlns:pic="http://schemas.openxmlformats.org/drawingml/2006/picture">
-                              <pic:nvPicPr>
-                                <pic:cNvPr id="33" name="图片 25"/>
-                                <pic:cNvPicPr>
-                                  <a:picLocks noChangeAspect="1" noChangeArrowheads="1"/>
-                                </pic:cNvPicPr>
-                              </pic:nvPicPr>
-                              <pic:blipFill>
-                                <a:blip r:embed="rId13">
-                                  <a:extLst>
-                                    <a:ext uri="{28A0092B-C50C-407E-A947-70E740481C1C}">
-                                      <a14:useLocalDpi xmlns:a14="http://schemas.microsoft.com/office/drawing/2010/main" val="0"/>
-                                    </a:ext>
-                                  </a:extLst>
-                                </a:blip>
-                                <a:srcRect/>
-                                <a:stretch>
-                                  <a:fillRect/>
-                                </a:stretch>
-                              </pic:blipFill>
-                              <pic:spPr>
-                                <a:xfrm>
-                                  <a:off x="21993" y="2640"/>
-                                  <a:ext cx="2273" cy="2273"/>
-                                </a:xfrm>
-                                <a:prstGeom prst="rect">
-                                  <a:avLst/>
-                                </a:prstGeom>
-                                <a:noFill/>
-                                <a:ln>
-                                  <a:noFill/>
-                                </a:ln>
-                              </pic:spPr>
-                            </pic:pic>
                           </wpg:wgp>
                         </a:graphicData>
                       </a:graphic>
@@ -7422,29 +7385,29 @@
                 </mc:Choice>
                 <mc:Fallback>
                   <w:pict>
-                    <v:group id="_x0000_s1026" o:spid="_x0000_s1026" o:spt="203" style="position:absolute;left:0pt;margin-left:1pt;margin-top:-40.55pt;height:113.6pt;width:247.5pt;z-index:251666432;mso-width-relative:page;mso-height-relative:page;" coordorigin="19315,2640" coordsize="4950,2272" o:gfxdata="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">
+                    <v:group id="_x0000_s1026" o:spid="_x0000_s1026" o:spt="203" style="position:absolute;left:0pt;margin-left:1pt;margin-top:-40.55pt;height:113.6pt;width:248.05pt;z-index:251666432;mso-width-relative:page;mso-height-relative:page;" coordorigin="17976,42945" coordsize="4961,2272" o:gfxdata="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">
                       <o:lock v:ext="edit" aspectratio="f"/>
-                      <v:group id="组合 22" o:spid="_x0000_s1026" o:spt="203" style="position:absolute;left:19315;top:3174;height:714;width:4415;" coordorigin="12525,9562" coordsize="4415,714" o:gfxdata="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">
-                        <o:lock v:ext="edit" aspectratio="f"/>
-                        <v:shape id="图片 29" o:spid="_x0000_s1026" o:spt="75" alt="IMG_256" type="#_x0000_t75" style="position:absolute;left:12525;top:9698;height:570;width:975;" filled="f" o:preferrelative="t" stroked="f" coordsize="21600,21600" o:gfxdata="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">
-                          <v:fill on="f" focussize="0,0"/>
-                          <v:stroke on="f"/>
-                          <v:imagedata r:id="rId15" chromakey="#FFFFFF" o:title=""/>
-                          <o:lock v:ext="edit" aspectratio="t"/>
-                        </v:shape>
-                        <v:shape id="_x0000_s1026" o:spid="_x0000_s1026" o:spt="75" alt="微信图片_20220215110121" type="#_x0000_t75" style="position:absolute;left:15706;top:9562;height:715;width:1234;" filled="f" o:preferrelative="t" stroked="f" coordsize="21600,21600" o:gfxdata="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">
-                          <v:fill on="f" focussize="0,0"/>
-                          <v:stroke on="f"/>
-                          <v:imagedata r:id="rId11" grayscale="t" bilevel="t" chromakey="#A09D98" o:title=""/>
-                          <o:lock v:ext="edit" aspectratio="t"/>
-                        </v:shape>
-                      </v:group>
-                      <v:shape id="图片 25" o:spid="_x0000_s1026" o:spt="75" type="#_x0000_t75" style="position:absolute;left:21993;top:2640;height:2273;width:2273;" filled="f" o:preferrelative="t" stroked="f" coordsize="21600,21600" o:gfxdata="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">
+                      <v:shape id="图片 25" o:spid="_x0000_s1026" o:spt="75" type="#_x0000_t75" style="position:absolute;left:20665;top:42945;height:2273;width:2273;" filled="f" o:preferrelative="t" stroked="f" coordsize="21600,21600" o:gfxdata="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">
                         <v:fill on="f" focussize="0,0"/>
                         <v:stroke on="f"/>
                         <v:imagedata r:id="rId13" o:title=""/>
                         <o:lock v:ext="edit" aspectratio="t"/>
                       </v:shape>
+                      <v:group id="组合 27" o:spid="_x0000_s1026" o:spt="203" style="position:absolute;left:17976;top:43614;height:626;width:4551;" coordorigin="17976,43614" coordsize="4551,626" o:gfxdata="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">
+                        <o:lock v:ext="edit" aspectratio="f"/>
+                        <v:shape id="图片 29" o:spid="_x0000_s1026" o:spt="75" alt="IMG_256" type="#_x0000_t75" style="position:absolute;left:17976;top:43615;height:570;width:975;" filled="f" o:preferrelative="t" stroked="f" coordsize="21600,21600" o:gfxdata="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">
+                          <v:fill on="f" focussize="0,0"/>
+                          <v:stroke on="f"/>
+                          <v:imagedata r:id="rId11" chromakey="#FFFFFF" o:title=""/>
+                          <o:lock v:ext="edit" aspectratio="t"/>
+                        </v:shape>
+                        <v:shape id="图片 59" o:spid="_x0000_s1026" o:spt="75" alt="图片1" type="#_x0000_t75" style="position:absolute;left:21059;top:43614;height:627;width:1468;" filled="f" o:preferrelative="t" stroked="f" coordsize="21600,21600" o:gfxdata="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">
+                          <v:fill on="f" focussize="0,0"/>
+                          <v:stroke on="f"/>
+                          <v:imagedata r:id="rId15" cropleft="5154f" croptop="7731f" cropright="3488f" cropbottom="12500f" grayscale="t" bilevel="t" o:title=""/>
+                          <o:lock v:ext="edit" aspectratio="t"/>
+                        </v:shape>
+                      </v:group>
                     </v:group>
                   </w:pict>
                 </mc:Fallback>
@@ -7743,569 +7706,6 @@
     <w:p>
       <w:pPr>
         <w:rPr>
-          <w:lang w:eastAsia="zh-CN"/>
-        </w:rPr>
-      </w:pPr>
-    </w:p>
-    <w:tbl>
-      <w:tblPr>
-        <w:tblStyle w:val="36"/>
-        <w:tblW w:w="6772" w:type="dxa"/>
-        <w:jc w:val="right"/>
-        <w:tblLayout w:type="fixed"/>
-        <w:tblCellMar>
-          <w:top w:w="0" w:type="dxa"/>
-          <w:left w:w="0" w:type="dxa"/>
-          <w:bottom w:w="0" w:type="dxa"/>
-          <w:right w:w="0" w:type="dxa"/>
-        </w:tblCellMar>
-      </w:tblPr>
-      <w:tblGrid>
-        <w:gridCol w:w="1272"/>
-        <w:gridCol w:w="2040"/>
-        <w:gridCol w:w="1166"/>
-        <w:gridCol w:w="2294"/>
-      </w:tblGrid>
-      <w:tr>
-        <w:trPr>
-          <w:trHeight w:val="441" w:hRule="exact"/>
-          <w:jc w:val="right"/>
-        </w:trPr>
-        <w:tc>
-          <w:tcPr>
-            <w:tcW w:w="1272" w:type="dxa"/>
-            <w:vAlign w:val="center"/>
-          </w:tcPr>
-          <w:p>
-            <w:pPr>
-              <w:pStyle w:val="20"/>
-              <w:spacing w:before="13"/>
-              <w:ind w:left="13" w:right="95"/>
-              <w:jc w:val="both"/>
-              <w:rPr>
-                <w:rFonts w:ascii="Times New Roman" w:hAnsi="Times New Roman" w:cs="Times New Roman"/>
-                <w:b/>
-                <w:sz w:val="24"/>
-                <w:szCs w:val="24"/>
-              </w:rPr>
-            </w:pPr>
-            <w:r>
-              <w:rPr>
-                <w:rFonts w:ascii="Times New Roman" w:hAnsi="Times New Roman" w:cs="Times New Roman"/>
-                <w:b/>
-                <w:sz w:val="24"/>
-                <w:szCs w:val="24"/>
-              </w:rPr>
-              <w:t>检测人：</w:t>
-            </w:r>
-          </w:p>
-        </w:tc>
-        <w:tc>
-          <w:tcPr>
-            <w:tcW w:w="2040" w:type="dxa"/>
-            <w:vAlign w:val="center"/>
-          </w:tcPr>
-          <w:p>
-            <w:pPr>
-              <w:pStyle w:val="20"/>
-              <w:spacing w:before="13"/>
-              <w:jc w:val="both"/>
-              <w:rPr>
-                <w:rFonts w:ascii="Times New Roman" w:hAnsi="Times New Roman" w:cs="Times New Roman"/>
-                <w:b/>
-                <w:sz w:val="24"/>
-                <w:szCs w:val="24"/>
-              </w:rPr>
-            </w:pPr>
-            <w:r>
-              <w:rPr>
-                <w:sz w:val="22"/>
-              </w:rPr>
-              <mc:AlternateContent>
-                <mc:Choice Requires="wpg">
-                  <w:drawing>
-                    <wp:anchor distT="0" distB="0" distL="114300" distR="114300" simplePos="0" relativeHeight="251667456" behindDoc="0" locked="0" layoutInCell="1" allowOverlap="1">
-                      <wp:simplePos x="0" y="0"/>
-                      <wp:positionH relativeFrom="column">
-                        <wp:posOffset>-66675</wp:posOffset>
-                      </wp:positionH>
-                      <wp:positionV relativeFrom="paragraph">
-                        <wp:posOffset>-510540</wp:posOffset>
-                      </wp:positionV>
-                      <wp:extent cx="3268345" cy="1442720"/>
-                      <wp:effectExtent l="0" t="0" r="8255" b="5080"/>
-                      <wp:wrapNone/>
-                      <wp:docPr id="74" name="组合 74"/>
-                      <wp:cNvGraphicFramePr/>
-                      <a:graphic xmlns:a="http://schemas.openxmlformats.org/drawingml/2006/main">
-                        <a:graphicData uri="http://schemas.microsoft.com/office/word/2010/wordprocessingGroup">
-                          <wpg:wgp>
-                            <wpg:cNvGrpSpPr/>
-                            <wpg:grpSpPr>
-                              <a:xfrm>
-                                <a:off x="0" y="0"/>
-                                <a:ext cx="3268345" cy="1442720"/>
-                                <a:chOff x="18998" y="4392"/>
-                                <a:chExt cx="5147" cy="2272"/>
-                              </a:xfrm>
-                            </wpg:grpSpPr>
-                            <wpg:grpSp>
-                              <wpg:cNvPr id="75" name="组合 42"/>
-                              <wpg:cNvGrpSpPr/>
-                              <wpg:grpSpPr>
-                                <a:xfrm rot="0">
-                                  <a:off x="18998" y="4887"/>
-                                  <a:ext cx="4576" cy="797"/>
-                                  <a:chOff x="12268" y="11374"/>
-                                  <a:chExt cx="4576" cy="797"/>
-                                </a:xfrm>
-                              </wpg:grpSpPr>
-                              <pic:pic xmlns:pic="http://schemas.openxmlformats.org/drawingml/2006/picture">
-                                <pic:nvPicPr>
-                                  <pic:cNvPr id="34" name="图片 48" descr="d6eaf1bc4e33dd49c55ac9b185f6f5b"/>
-                                  <pic:cNvPicPr>
-                                    <a:picLocks noChangeAspect="1"/>
-                                  </pic:cNvPicPr>
-                                </pic:nvPicPr>
-                                <pic:blipFill>
-                                  <a:blip r:embed="rId16">
-                                    <a:clrChange>
-                                      <a:clrFrom>
-                                        <a:srgbClr val="FFFDFF">
-                                          <a:alpha val="100000"/>
-                                        </a:srgbClr>
-                                      </a:clrFrom>
-                                      <a:clrTo>
-                                        <a:srgbClr val="FFFDFF">
-                                          <a:alpha val="100000"/>
-                                          <a:alpha val="0"/>
-                                        </a:srgbClr>
-                                      </a:clrTo>
-                                    </a:clrChange>
-                                  </a:blip>
-                                  <a:srcRect l="5435" t="13377" r="6271" b="18114"/>
-                                  <a:stretch>
-                                    <a:fillRect/>
-                                  </a:stretch>
-                                </pic:blipFill>
-                                <pic:spPr>
-                                  <a:xfrm>
-                                    <a:off x="12268" y="11459"/>
-                                    <a:ext cx="1630" cy="712"/>
-                                  </a:xfrm>
-                                  <a:prstGeom prst="rect">
-                                    <a:avLst/>
-                                  </a:prstGeom>
-                                </pic:spPr>
-                              </pic:pic>
-                              <pic:pic xmlns:pic="http://schemas.openxmlformats.org/drawingml/2006/picture">
-                                <pic:nvPicPr>
-                                  <pic:cNvPr id="49" name="图片 41" descr="微信图片_20220215110121"/>
-                                  <pic:cNvPicPr>
-                                    <a:picLocks noChangeAspect="1"/>
-                                  </pic:cNvPicPr>
-                                </pic:nvPicPr>
-                                <pic:blipFill>
-                                  <a:blip r:embed="rId11">
-                                    <a:clrChange>
-                                      <a:clrFrom>
-                                        <a:srgbClr val="A09D98">
-                                          <a:alpha val="100000"/>
-                                        </a:srgbClr>
-                                      </a:clrFrom>
-                                      <a:clrTo>
-                                        <a:srgbClr val="A09D98">
-                                          <a:alpha val="100000"/>
-                                          <a:alpha val="0"/>
-                                        </a:srgbClr>
-                                      </a:clrTo>
-                                    </a:clrChange>
-                                    <a:biLevel thresh="50000"/>
-                                  </a:blip>
-                                  <a:stretch>
-                                    <a:fillRect/>
-                                  </a:stretch>
-                                </pic:blipFill>
-                                <pic:spPr>
-                                  <a:xfrm>
-                                    <a:off x="15610" y="11374"/>
-                                    <a:ext cx="1234" cy="715"/>
-                                  </a:xfrm>
-                                  <a:prstGeom prst="rect">
-                                    <a:avLst/>
-                                  </a:prstGeom>
-                                </pic:spPr>
-                              </pic:pic>
-                            </wpg:grpSp>
-                            <pic:pic xmlns:pic="http://schemas.openxmlformats.org/drawingml/2006/picture">
-                              <pic:nvPicPr>
-                                <pic:cNvPr id="48" name="图片 27"/>
-                                <pic:cNvPicPr>
-                                  <a:picLocks noChangeAspect="1" noChangeArrowheads="1"/>
-                                </pic:cNvPicPr>
-                              </pic:nvPicPr>
-                              <pic:blipFill>
-                                <a:blip r:embed="rId13">
-                                  <a:extLst>
-                                    <a:ext uri="{28A0092B-C50C-407E-A947-70E740481C1C}">
-                                      <a14:useLocalDpi xmlns:a14="http://schemas.microsoft.com/office/drawing/2010/main" val="0"/>
-                                    </a:ext>
-                                  </a:extLst>
-                                </a:blip>
-                                <a:srcRect/>
-                                <a:stretch>
-                                  <a:fillRect/>
-                                </a:stretch>
-                              </pic:blipFill>
-                              <pic:spPr>
-                                <a:xfrm>
-                                  <a:off x="21873" y="4392"/>
-                                  <a:ext cx="2273" cy="2273"/>
-                                </a:xfrm>
-                                <a:prstGeom prst="rect">
-                                  <a:avLst/>
-                                </a:prstGeom>
-                                <a:noFill/>
-                                <a:ln>
-                                  <a:noFill/>
-                                </a:ln>
-                              </pic:spPr>
-                            </pic:pic>
-                          </wpg:wgp>
-                        </a:graphicData>
-                      </a:graphic>
-                    </wp:anchor>
-                  </w:drawing>
-                </mc:Choice>
-                <mc:Fallback>
-                  <w:pict>
-                    <v:group id="_x0000_s1026" o:spid="_x0000_s1026" o:spt="203" style="position:absolute;left:0pt;margin-left:-5.25pt;margin-top:-40.2pt;height:113.6pt;width:257.35pt;z-index:251667456;mso-width-relative:page;mso-height-relative:page;" coordorigin="18998,4392" coordsize="5147,2272" o:gfxdata="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">
-                      <o:lock v:ext="edit" aspectratio="f"/>
-                      <v:group id="组合 42" o:spid="_x0000_s1026" o:spt="203" style="position:absolute;left:18998;top:4887;height:797;width:4576;" coordorigin="12268,11374" coordsize="4576,797" o:gfxdata="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">
-                        <o:lock v:ext="edit" aspectratio="f"/>
-                        <v:shape id="图片 48" o:spid="_x0000_s1026" o:spt="75" alt="d6eaf1bc4e33dd49c55ac9b185f6f5b" type="#_x0000_t75" style="position:absolute;left:12268;top:11459;height:712;width:1630;" filled="f" o:preferrelative="t" stroked="f" coordsize="21600,21600" o:gfxdata="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">
-                          <v:fill on="f" focussize="0,0"/>
-                          <v:stroke on="f"/>
-                          <v:imagedata r:id="rId16" cropleft="3562f" croptop="8767f" cropright="4110f" cropbottom="11871f" chromakey="#FFFDFF" o:title=""/>
-                          <o:lock v:ext="edit" aspectratio="t"/>
-                        </v:shape>
-                        <v:shape id="图片 41" o:spid="_x0000_s1026" o:spt="75" alt="微信图片_20220215110121" type="#_x0000_t75" style="position:absolute;left:15610;top:11374;height:715;width:1234;" filled="f" o:preferrelative="t" stroked="f" coordsize="21600,21600" o:gfxdata="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">
-                          <v:fill on="f" focussize="0,0"/>
-                          <v:stroke on="f"/>
-                          <v:imagedata r:id="rId11" grayscale="t" bilevel="t" chromakey="#A09D98" o:title=""/>
-                          <o:lock v:ext="edit" aspectratio="t"/>
-                        </v:shape>
-                      </v:group>
-                      <v:shape id="图片 27" o:spid="_x0000_s1026" o:spt="75" type="#_x0000_t75" style="position:absolute;left:21873;top:4392;height:2273;width:2273;" filled="f" o:preferrelative="t" stroked="f" coordsize="21600,21600" o:gfxdata="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">
-                        <v:fill on="f" focussize="0,0"/>
-                        <v:stroke on="f"/>
-                        <v:imagedata r:id="rId13" o:title=""/>
-                        <o:lock v:ext="edit" aspectratio="t"/>
-                      </v:shape>
-                    </v:group>
-                  </w:pict>
-                </mc:Fallback>
-              </mc:AlternateContent>
-            </w:r>
-          </w:p>
-        </w:tc>
-        <w:tc>
-          <w:tcPr>
-            <w:tcW w:w="1166" w:type="dxa"/>
-            <w:vAlign w:val="center"/>
-          </w:tcPr>
-          <w:p>
-            <w:pPr>
-              <w:pStyle w:val="20"/>
-              <w:spacing w:before="13"/>
-              <w:jc w:val="both"/>
-              <w:rPr>
-                <w:rFonts w:ascii="Times New Roman" w:hAnsi="Times New Roman" w:cs="Times New Roman"/>
-                <w:b/>
-                <w:sz w:val="24"/>
-                <w:szCs w:val="24"/>
-              </w:rPr>
-            </w:pPr>
-            <w:r>
-              <w:rPr>
-                <w:rFonts w:ascii="Times New Roman" w:hAnsi="Times New Roman" w:cs="Times New Roman"/>
-                <w:b/>
-                <w:sz w:val="24"/>
-                <w:szCs w:val="24"/>
-              </w:rPr>
-              <w:t>复核人</w:t>
-            </w:r>
-            <w:r>
-              <w:rPr>
-                <w:rFonts w:ascii="Times New Roman" w:hAnsi="Times New Roman" w:cs="Times New Roman"/>
-                <w:b/>
-                <w:sz w:val="24"/>
-                <w:szCs w:val="24"/>
-                <w:lang w:eastAsia="zh-CN"/>
-              </w:rPr>
-              <w:t>：</w:t>
-            </w:r>
-          </w:p>
-        </w:tc>
-        <w:tc>
-          <w:tcPr>
-            <w:tcW w:w="2294" w:type="dxa"/>
-            <w:vAlign w:val="center"/>
-          </w:tcPr>
-          <w:p>
-            <w:pPr>
-              <w:pStyle w:val="20"/>
-              <w:spacing w:before="13"/>
-              <w:ind w:right="15"/>
-              <w:jc w:val="both"/>
-              <w:rPr>
-                <w:rFonts w:ascii="Times New Roman" w:hAnsi="Times New Roman" w:cs="Times New Roman"/>
-                <w:b/>
-                <w:sz w:val="24"/>
-                <w:szCs w:val="24"/>
-              </w:rPr>
-            </w:pPr>
-          </w:p>
-        </w:tc>
-      </w:tr>
-      <w:tr>
-        <w:tblPrEx>
-          <w:tblCellMar>
-            <w:top w:w="0" w:type="dxa"/>
-            <w:left w:w="0" w:type="dxa"/>
-            <w:bottom w:w="0" w:type="dxa"/>
-            <w:right w:w="0" w:type="dxa"/>
-          </w:tblCellMar>
-        </w:tblPrEx>
-        <w:trPr>
-          <w:trHeight w:val="457" w:hRule="exact"/>
-          <w:jc w:val="right"/>
-        </w:trPr>
-        <w:tc>
-          <w:tcPr>
-            <w:tcW w:w="1272" w:type="dxa"/>
-            <w:vAlign w:val="center"/>
-          </w:tcPr>
-          <w:p>
-            <w:pPr>
-              <w:pStyle w:val="20"/>
-              <w:spacing w:line="341" w:lineRule="exact"/>
-              <w:ind w:left="13" w:right="165"/>
-              <w:jc w:val="both"/>
-              <w:rPr>
-                <w:rFonts w:ascii="Times New Roman" w:hAnsi="Times New Roman" w:cs="Times New Roman"/>
-                <w:b/>
-                <w:sz w:val="24"/>
-                <w:szCs w:val="24"/>
-              </w:rPr>
-            </w:pPr>
-            <w:r>
-              <w:rPr>
-                <w:rFonts w:ascii="Times New Roman" w:hAnsi="Times New Roman" w:cs="Times New Roman"/>
-                <w:b/>
-                <w:sz w:val="24"/>
-                <w:szCs w:val="24"/>
-              </w:rPr>
-              <w:t>日</w:t>
-            </w:r>
-            <w:r>
-              <w:rPr>
-                <w:rFonts w:ascii="Times New Roman" w:hAnsi="Times New Roman" w:cs="Times New Roman"/>
-                <w:b/>
-                <w:sz w:val="24"/>
-                <w:szCs w:val="24"/>
-                <w:lang w:eastAsia="zh-CN"/>
-              </w:rPr>
-              <w:t xml:space="preserve">  </w:t>
-            </w:r>
-            <w:r>
-              <w:rPr>
-                <w:rFonts w:ascii="Times New Roman" w:hAnsi="Times New Roman" w:cs="Times New Roman"/>
-                <w:b/>
-                <w:sz w:val="24"/>
-                <w:szCs w:val="24"/>
-              </w:rPr>
-              <w:t>期：</w:t>
-            </w:r>
-          </w:p>
-        </w:tc>
-        <w:tc>
-          <w:tcPr>
-            <w:tcW w:w="2040" w:type="dxa"/>
-            <w:vAlign w:val="center"/>
-          </w:tcPr>
-          <w:p>
-            <w:pPr>
-              <w:pStyle w:val="20"/>
-              <w:spacing w:line="363" w:lineRule="exact"/>
-              <w:jc w:val="both"/>
-              <w:rPr>
-                <w:rFonts w:ascii="Times New Roman" w:hAnsi="Times New Roman" w:cs="Times New Roman"/>
-                <w:sz w:val="24"/>
-                <w:szCs w:val="24"/>
-              </w:rPr>
-            </w:pPr>
-            <w:r>
-              <w:rPr>
-                <w:rFonts w:ascii="Times New Roman" w:hAnsi="Times New Roman" w:cs="Times New Roman"/>
-                <w:kern w:val="2"/>
-                <w:sz w:val="24"/>
-                <w:szCs w:val="24"/>
-                <w:lang w:eastAsia="zh-CN"/>
-              </w:rPr>
-              <w:t>{{ reportdate }}</w:t>
-            </w:r>
-          </w:p>
-        </w:tc>
-        <w:tc>
-          <w:tcPr>
-            <w:tcW w:w="1166" w:type="dxa"/>
-            <w:vAlign w:val="center"/>
-          </w:tcPr>
-          <w:p>
-            <w:pPr>
-              <w:pStyle w:val="20"/>
-              <w:spacing w:line="341" w:lineRule="exact"/>
-              <w:jc w:val="both"/>
-              <w:rPr>
-                <w:rFonts w:ascii="Times New Roman" w:hAnsi="Times New Roman" w:cs="Times New Roman"/>
-                <w:b/>
-                <w:sz w:val="24"/>
-                <w:szCs w:val="24"/>
-              </w:rPr>
-            </w:pPr>
-            <w:r>
-              <w:rPr>
-                <w:rFonts w:ascii="Times New Roman" w:hAnsi="Times New Roman" w:cs="Times New Roman"/>
-                <w:b/>
-                <w:sz w:val="24"/>
-                <w:szCs w:val="24"/>
-              </w:rPr>
-              <w:t>日</w:t>
-            </w:r>
-            <w:r>
-              <w:rPr>
-                <w:rFonts w:ascii="Times New Roman" w:hAnsi="Times New Roman" w:cs="Times New Roman"/>
-                <w:b/>
-                <w:sz w:val="24"/>
-                <w:szCs w:val="24"/>
-                <w:lang w:eastAsia="zh-CN"/>
-              </w:rPr>
-              <w:t xml:space="preserve">  </w:t>
-            </w:r>
-            <w:r>
-              <w:rPr>
-                <w:rFonts w:ascii="Times New Roman" w:hAnsi="Times New Roman" w:cs="Times New Roman"/>
-                <w:b/>
-                <w:sz w:val="24"/>
-                <w:szCs w:val="24"/>
-              </w:rPr>
-              <w:t>期：</w:t>
-            </w:r>
-          </w:p>
-        </w:tc>
-        <w:tc>
-          <w:tcPr>
-            <w:tcW w:w="2294" w:type="dxa"/>
-            <w:vAlign w:val="center"/>
-          </w:tcPr>
-          <w:p>
-            <w:pPr>
-              <w:pStyle w:val="20"/>
-              <w:spacing w:line="363" w:lineRule="exact"/>
-              <w:ind w:right="15"/>
-              <w:jc w:val="both"/>
-              <w:rPr>
-                <w:rFonts w:ascii="Times New Roman" w:hAnsi="Times New Roman" w:cs="Times New Roman"/>
-                <w:sz w:val="24"/>
-                <w:szCs w:val="24"/>
-              </w:rPr>
-            </w:pPr>
-            <w:r>
-              <w:rPr>
-                <w:rFonts w:ascii="Times New Roman" w:hAnsi="Times New Roman" w:cs="Times New Roman"/>
-                <w:kern w:val="2"/>
-                <w:sz w:val="24"/>
-                <w:szCs w:val="24"/>
-                <w:lang w:eastAsia="zh-CN"/>
-              </w:rPr>
-              <w:t>{{ reportdate }}</w:t>
-            </w:r>
-          </w:p>
-        </w:tc>
-      </w:tr>
-    </w:tbl>
-    <w:p>
-      <w:pPr>
-        <w:rPr>
-          <w:rFonts w:ascii="Times New Roman" w:hAnsi="Times New Roman" w:eastAsia="微软雅黑" w:cs="Times New Roman"/>
-          <w:sz w:val="24"/>
-          <w:szCs w:val="24"/>
-          <w:lang w:eastAsia="zh-CN"/>
-        </w:rPr>
-      </w:pPr>
-      <w:r>
-        <w:rPr>
-          <w:rFonts w:hint="eastAsia" w:ascii="Times New Roman" w:hAnsi="Times New Roman" w:eastAsia="微软雅黑" w:cs="Times New Roman"/>
-          <w:sz w:val="24"/>
-          <w:szCs w:val="24"/>
-          <w:lang w:eastAsia="zh-CN"/>
-        </w:rPr>
-        <w:t xml:space="preserve">{% endif %}{% if testedby == </w:t>
-      </w:r>
-      <w:r>
-        <w:rPr>
-          <w:rFonts w:ascii="Times New Roman" w:hAnsi="Times New Roman" w:eastAsia="微软雅黑" w:cs="Times New Roman"/>
-          <w:sz w:val="24"/>
-          <w:szCs w:val="24"/>
-          <w:lang w:eastAsia="zh-CN"/>
-        </w:rPr>
-        <w:t>“</w:t>
-      </w:r>
-      <w:r>
-        <w:rPr>
-          <w:rFonts w:hint="eastAsia" w:ascii="Times New Roman" w:hAnsi="Times New Roman" w:eastAsia="微软雅黑" w:cs="Times New Roman"/>
-          <w:sz w:val="24"/>
-          <w:szCs w:val="24"/>
-          <w:lang w:eastAsia="zh-CN"/>
-        </w:rPr>
-        <w:t>6</w:t>
-      </w:r>
-      <w:r>
-        <w:rPr>
-          <w:rFonts w:ascii="Times New Roman" w:hAnsi="Times New Roman" w:eastAsia="微软雅黑" w:cs="Times New Roman"/>
-          <w:sz w:val="24"/>
-          <w:szCs w:val="24"/>
-          <w:lang w:eastAsia="zh-CN"/>
-        </w:rPr>
-        <w:t>”</w:t>
-      </w:r>
-      <w:r>
-        <w:rPr>
-          <w:rFonts w:hint="eastAsia" w:ascii="Times New Roman" w:hAnsi="Times New Roman" w:eastAsia="微软雅黑" w:cs="Times New Roman"/>
-          <w:sz w:val="24"/>
-          <w:szCs w:val="24"/>
-          <w:lang w:eastAsia="zh-CN"/>
-        </w:rPr>
-        <w:t xml:space="preserve"> %}</w:t>
-      </w:r>
-    </w:p>
-    <w:p>
-      <w:pPr>
-        <w:rPr>
-          <w:rFonts w:ascii="Times New Roman" w:hAnsi="Times New Roman" w:eastAsia="微软雅黑" w:cs="Times New Roman"/>
-          <w:sz w:val="24"/>
-          <w:szCs w:val="24"/>
-          <w:lang w:eastAsia="zh-CN"/>
-        </w:rPr>
-      </w:pPr>
-    </w:p>
-    <w:p>
-      <w:pPr>
-        <w:rPr>
-          <w:rFonts w:ascii="Times New Roman" w:hAnsi="Times New Roman" w:eastAsia="微软雅黑" w:cs="Times New Roman"/>
-          <w:sz w:val="24"/>
-          <w:szCs w:val="24"/>
           <w:lang w:eastAsia="zh-CN"/>
         </w:rPr>
       </w:pPr>
@@ -8388,200 +7788,6 @@
                 <w:szCs w:val="24"/>
               </w:rPr>
             </w:pPr>
-            <w:r>
-              <w:rPr>
-                <w:sz w:val="22"/>
-              </w:rPr>
-              <mc:AlternateContent>
-                <mc:Choice Requires="wpg">
-                  <w:drawing>
-                    <wp:anchor distT="0" distB="0" distL="114300" distR="114300" simplePos="0" relativeHeight="251668480" behindDoc="0" locked="0" layoutInCell="1" allowOverlap="1">
-                      <wp:simplePos x="0" y="0"/>
-                      <wp:positionH relativeFrom="column">
-                        <wp:posOffset>111760</wp:posOffset>
-                      </wp:positionH>
-                      <wp:positionV relativeFrom="paragraph">
-                        <wp:posOffset>-577215</wp:posOffset>
-                      </wp:positionV>
-                      <wp:extent cx="3059430" cy="1442720"/>
-                      <wp:effectExtent l="0" t="0" r="3810" b="5080"/>
-                      <wp:wrapNone/>
-                      <wp:docPr id="76" name="组合 76"/>
-                      <wp:cNvGraphicFramePr/>
-                      <a:graphic xmlns:a="http://schemas.openxmlformats.org/drawingml/2006/main">
-                        <a:graphicData uri="http://schemas.microsoft.com/office/word/2010/wordprocessingGroup">
-                          <wpg:wgp>
-                            <wpg:cNvGrpSpPr/>
-                            <wpg:grpSpPr>
-                              <a:xfrm>
-                                <a:off x="0" y="0"/>
-                                <a:ext cx="3059430" cy="1442720"/>
-                                <a:chOff x="19399" y="6180"/>
-                                <a:chExt cx="4818" cy="2272"/>
-                              </a:xfrm>
-                            </wpg:grpSpPr>
-                            <wpg:grpSp>
-                              <wpg:cNvPr id="77" name="组合 34"/>
-                              <wpg:cNvGrpSpPr/>
-                              <wpg:grpSpPr>
-                                <a:xfrm rot="0">
-                                  <a:off x="19399" y="6701"/>
-                                  <a:ext cx="4343" cy="988"/>
-                                  <a:chOff x="12609" y="13215"/>
-                                  <a:chExt cx="4343" cy="988"/>
-                                </a:xfrm>
-                              </wpg:grpSpPr>
-                              <pic:pic xmlns:pic="http://schemas.openxmlformats.org/drawingml/2006/picture">
-                                <pic:nvPicPr>
-                                  <pic:cNvPr id="50" name="图片 1" descr="IMG_256"/>
-                                  <pic:cNvPicPr>
-                                    <a:picLocks noChangeAspect="1"/>
-                                  </pic:cNvPicPr>
-                                </pic:nvPicPr>
-                                <pic:blipFill>
-                                  <a:blip r:embed="rId17">
-                                    <a:clrChange>
-                                      <a:clrFrom>
-                                        <a:srgbClr val="AAA9A5">
-                                          <a:alpha val="100000"/>
-                                        </a:srgbClr>
-                                      </a:clrFrom>
-                                      <a:clrTo>
-                                        <a:srgbClr val="AAA9A5">
-                                          <a:alpha val="100000"/>
-                                          <a:alpha val="0"/>
-                                        </a:srgbClr>
-                                      </a:clrTo>
-                                    </a:clrChange>
-                                  </a:blip>
-                                  <a:srcRect l="27431" t="30452" r="31962" b="18126"/>
-                                  <a:stretch>
-                                    <a:fillRect/>
-                                  </a:stretch>
-                                </pic:blipFill>
-                                <pic:spPr>
-                                  <a:xfrm>
-                                    <a:off x="12609" y="13215"/>
-                                    <a:ext cx="781" cy="989"/>
-                                  </a:xfrm>
-                                  <a:prstGeom prst="rect">
-                                    <a:avLst/>
-                                  </a:prstGeom>
-                                  <a:noFill/>
-                                  <a:ln w="9525">
-                                    <a:noFill/>
-                                  </a:ln>
-                                </pic:spPr>
-                              </pic:pic>
-                              <pic:pic xmlns:pic="http://schemas.openxmlformats.org/drawingml/2006/picture">
-                                <pic:nvPicPr>
-                                  <pic:cNvPr id="54" name="图片 31" descr="微信图片_20220215110121"/>
-                                  <pic:cNvPicPr>
-                                    <a:picLocks noChangeAspect="1"/>
-                                  </pic:cNvPicPr>
-                                </pic:nvPicPr>
-                                <pic:blipFill>
-                                  <a:blip r:embed="rId11">
-                                    <a:clrChange>
-                                      <a:clrFrom>
-                                        <a:srgbClr val="A09D98">
-                                          <a:alpha val="100000"/>
-                                        </a:srgbClr>
-                                      </a:clrFrom>
-                                      <a:clrTo>
-                                        <a:srgbClr val="A09D98">
-                                          <a:alpha val="100000"/>
-                                          <a:alpha val="0"/>
-                                        </a:srgbClr>
-                                      </a:clrTo>
-                                    </a:clrChange>
-                                    <a:biLevel thresh="50000"/>
-                                  </a:blip>
-                                  <a:stretch>
-                                    <a:fillRect/>
-                                  </a:stretch>
-                                </pic:blipFill>
-                                <pic:spPr>
-                                  <a:xfrm>
-                                    <a:off x="15718" y="13246"/>
-                                    <a:ext cx="1234" cy="715"/>
-                                  </a:xfrm>
-                                  <a:prstGeom prst="rect">
-                                    <a:avLst/>
-                                  </a:prstGeom>
-                                </pic:spPr>
-                              </pic:pic>
-                            </wpg:grpSp>
-                            <pic:pic xmlns:pic="http://schemas.openxmlformats.org/drawingml/2006/picture">
-                              <pic:nvPicPr>
-                                <pic:cNvPr id="51" name="图片 32"/>
-                                <pic:cNvPicPr>
-                                  <a:picLocks noChangeAspect="1" noChangeArrowheads="1"/>
-                                </pic:cNvPicPr>
-                              </pic:nvPicPr>
-                              <pic:blipFill>
-                                <a:blip r:embed="rId13">
-                                  <a:extLst>
-                                    <a:ext uri="{28A0092B-C50C-407E-A947-70E740481C1C}">
-                                      <a14:useLocalDpi xmlns:a14="http://schemas.microsoft.com/office/drawing/2010/main" val="0"/>
-                                    </a:ext>
-                                  </a:extLst>
-                                </a:blip>
-                                <a:srcRect/>
-                                <a:stretch>
-                                  <a:fillRect/>
-                                </a:stretch>
-                              </pic:blipFill>
-                              <pic:spPr>
-                                <a:xfrm>
-                                  <a:off x="21945" y="6180"/>
-                                  <a:ext cx="2273" cy="2273"/>
-                                </a:xfrm>
-                                <a:prstGeom prst="rect">
-                                  <a:avLst/>
-                                </a:prstGeom>
-                                <a:noFill/>
-                                <a:ln>
-                                  <a:noFill/>
-                                </a:ln>
-                              </pic:spPr>
-                            </pic:pic>
-                          </wpg:wgp>
-                        </a:graphicData>
-                      </a:graphic>
-                    </wp:anchor>
-                  </w:drawing>
-                </mc:Choice>
-                <mc:Fallback>
-                  <w:pict>
-                    <v:group id="_x0000_s1026" o:spid="_x0000_s1026" o:spt="203" style="position:absolute;left:0pt;margin-left:8.8pt;margin-top:-45.45pt;height:113.6pt;width:240.9pt;z-index:251668480;mso-width-relative:page;mso-height-relative:page;" coordorigin="19399,6180" coordsize="4818,2272" o:gfxdata="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">
-                      <o:lock v:ext="edit" aspectratio="f"/>
-                      <v:group id="组合 34" o:spid="_x0000_s1026" o:spt="203" style="position:absolute;left:19399;top:6701;height:988;width:4343;" coordorigin="12609,13215" coordsize="4343,988" o:gfxdata="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">
-                        <o:lock v:ext="edit" aspectratio="f"/>
-                        <v:shape id="图片 1" o:spid="_x0000_s1026" o:spt="75" alt="IMG_256" type="#_x0000_t75" style="position:absolute;left:12609;top:13215;height:989;width:781;" filled="f" o:preferrelative="t" stroked="f" coordsize="21600,21600" o:gfxdata="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">
-                          <v:fill on="f" focussize="0,0"/>
-                          <v:stroke on="f"/>
-                          <v:imagedata r:id="rId17" cropleft="17977f" croptop="19957f" cropright="20947f" cropbottom="11879f" chromakey="#AAA9A5" o:title=""/>
-                          <o:lock v:ext="edit" aspectratio="t"/>
-                        </v:shape>
-                        <v:shape id="图片 31" o:spid="_x0000_s1026" o:spt="75" alt="微信图片_20220215110121" type="#_x0000_t75" style="position:absolute;left:15718;top:13246;height:715;width:1234;" filled="f" o:preferrelative="t" stroked="f" coordsize="21600,21600" o:gfxdata="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">
-                          <v:fill on="f" focussize="0,0"/>
-                          <v:stroke on="f"/>
-                          <v:imagedata r:id="rId11" grayscale="t" bilevel="t" chromakey="#A09D98" o:title=""/>
-                          <o:lock v:ext="edit" aspectratio="t"/>
-                        </v:shape>
-                      </v:group>
-                      <v:shape id="图片 32" o:spid="_x0000_s1026" o:spt="75" type="#_x0000_t75" style="position:absolute;left:21945;top:6180;height:2273;width:2273;" filled="f" o:preferrelative="t" stroked="f" coordsize="21600,21600" o:gfxdata="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">
-                        <v:fill on="f" focussize="0,0"/>
-                        <v:stroke on="f"/>
-                        <v:imagedata r:id="rId13" o:title=""/>
-                        <o:lock v:ext="edit" aspectratio="t"/>
-                      </v:shape>
-                    </v:group>
-                  </w:pict>
-                </mc:Fallback>
-              </mc:AlternateContent>
-            </w:r>
           </w:p>
         </w:tc>
         <w:tc>
@@ -8814,6 +8020,387 @@
       <w:pPr>
         <w:rPr>
           <w:rFonts w:ascii="Times New Roman" w:hAnsi="Times New Roman" w:eastAsia="微软雅黑" w:cs="Times New Roman"/>
+          <w:sz w:val="24"/>
+          <w:szCs w:val="24"/>
+          <w:lang w:eastAsia="zh-CN"/>
+        </w:rPr>
+      </w:pPr>
+      <w:r>
+        <w:rPr>
+          <w:rFonts w:hint="eastAsia" w:ascii="Times New Roman" w:hAnsi="Times New Roman" w:eastAsia="微软雅黑" w:cs="Times New Roman"/>
+          <w:sz w:val="24"/>
+          <w:szCs w:val="24"/>
+          <w:lang w:eastAsia="zh-CN"/>
+        </w:rPr>
+        <w:t xml:space="preserve">{% endif %}{% if testedby == </w:t>
+      </w:r>
+      <w:r>
+        <w:rPr>
+          <w:rFonts w:ascii="Times New Roman" w:hAnsi="Times New Roman" w:eastAsia="微软雅黑" w:cs="Times New Roman"/>
+          <w:sz w:val="24"/>
+          <w:szCs w:val="24"/>
+          <w:lang w:eastAsia="zh-CN"/>
+        </w:rPr>
+        <w:t>“</w:t>
+      </w:r>
+      <w:r>
+        <w:rPr>
+          <w:rFonts w:hint="eastAsia" w:ascii="Times New Roman" w:hAnsi="Times New Roman" w:eastAsia="微软雅黑" w:cs="Times New Roman"/>
+          <w:sz w:val="24"/>
+          <w:szCs w:val="24"/>
+          <w:lang w:eastAsia="zh-CN"/>
+        </w:rPr>
+        <w:t>6</w:t>
+      </w:r>
+      <w:r>
+        <w:rPr>
+          <w:rFonts w:ascii="Times New Roman" w:hAnsi="Times New Roman" w:eastAsia="微软雅黑" w:cs="Times New Roman"/>
+          <w:sz w:val="24"/>
+          <w:szCs w:val="24"/>
+          <w:lang w:eastAsia="zh-CN"/>
+        </w:rPr>
+        <w:t>”</w:t>
+      </w:r>
+      <w:r>
+        <w:rPr>
+          <w:rFonts w:hint="eastAsia" w:ascii="Times New Roman" w:hAnsi="Times New Roman" w:eastAsia="微软雅黑" w:cs="Times New Roman"/>
+          <w:sz w:val="24"/>
+          <w:szCs w:val="24"/>
+          <w:lang w:eastAsia="zh-CN"/>
+        </w:rPr>
+        <w:t xml:space="preserve"> %}</w:t>
+      </w:r>
+    </w:p>
+    <w:p>
+      <w:pPr>
+        <w:rPr>
+          <w:rFonts w:ascii="Times New Roman" w:hAnsi="Times New Roman" w:eastAsia="微软雅黑" w:cs="Times New Roman"/>
+          <w:sz w:val="24"/>
+          <w:szCs w:val="24"/>
+          <w:lang w:eastAsia="zh-CN"/>
+        </w:rPr>
+      </w:pPr>
+    </w:p>
+    <w:p>
+      <w:pPr>
+        <w:rPr>
+          <w:rFonts w:ascii="Times New Roman" w:hAnsi="Times New Roman" w:eastAsia="微软雅黑" w:cs="Times New Roman"/>
+          <w:sz w:val="24"/>
+          <w:szCs w:val="24"/>
+          <w:lang w:eastAsia="zh-CN"/>
+        </w:rPr>
+      </w:pPr>
+    </w:p>
+    <w:tbl>
+      <w:tblPr>
+        <w:tblStyle w:val="36"/>
+        <w:tblW w:w="6772" w:type="dxa"/>
+        <w:jc w:val="right"/>
+        <w:tblLayout w:type="fixed"/>
+        <w:tblCellMar>
+          <w:top w:w="0" w:type="dxa"/>
+          <w:left w:w="0" w:type="dxa"/>
+          <w:bottom w:w="0" w:type="dxa"/>
+          <w:right w:w="0" w:type="dxa"/>
+        </w:tblCellMar>
+      </w:tblPr>
+      <w:tblGrid>
+        <w:gridCol w:w="1272"/>
+        <w:gridCol w:w="2040"/>
+        <w:gridCol w:w="1166"/>
+        <w:gridCol w:w="2294"/>
+      </w:tblGrid>
+      <w:tr>
+        <w:tblPrEx>
+          <w:tblCellMar>
+            <w:top w:w="0" w:type="dxa"/>
+            <w:left w:w="0" w:type="dxa"/>
+            <w:bottom w:w="0" w:type="dxa"/>
+            <w:right w:w="0" w:type="dxa"/>
+          </w:tblCellMar>
+        </w:tblPrEx>
+        <w:trPr>
+          <w:trHeight w:val="441" w:hRule="exact"/>
+          <w:jc w:val="right"/>
+        </w:trPr>
+        <w:tc>
+          <w:tcPr>
+            <w:tcW w:w="1272" w:type="dxa"/>
+            <w:vAlign w:val="center"/>
+          </w:tcPr>
+          <w:p>
+            <w:pPr>
+              <w:pStyle w:val="20"/>
+              <w:spacing w:before="13"/>
+              <w:ind w:left="13" w:right="95"/>
+              <w:jc w:val="both"/>
+              <w:rPr>
+                <w:rFonts w:ascii="Times New Roman" w:hAnsi="Times New Roman" w:cs="Times New Roman"/>
+                <w:b/>
+                <w:sz w:val="24"/>
+                <w:szCs w:val="24"/>
+              </w:rPr>
+            </w:pPr>
+            <w:r>
+              <w:rPr>
+                <w:rFonts w:ascii="Times New Roman" w:hAnsi="Times New Roman" w:cs="Times New Roman"/>
+                <w:b/>
+                <w:sz w:val="24"/>
+                <w:szCs w:val="24"/>
+              </w:rPr>
+              <w:t>检测人：</w:t>
+            </w:r>
+          </w:p>
+        </w:tc>
+        <w:tc>
+          <w:tcPr>
+            <w:tcW w:w="2040" w:type="dxa"/>
+            <w:vAlign w:val="center"/>
+          </w:tcPr>
+          <w:p>
+            <w:pPr>
+              <w:pStyle w:val="20"/>
+              <w:spacing w:before="13"/>
+              <w:jc w:val="both"/>
+              <w:rPr>
+                <w:rFonts w:ascii="Times New Roman" w:hAnsi="Times New Roman" w:cs="Times New Roman"/>
+                <w:b/>
+                <w:sz w:val="24"/>
+                <w:szCs w:val="24"/>
+              </w:rPr>
+            </w:pPr>
+          </w:p>
+        </w:tc>
+        <w:tc>
+          <w:tcPr>
+            <w:tcW w:w="1166" w:type="dxa"/>
+            <w:vAlign w:val="center"/>
+          </w:tcPr>
+          <w:p>
+            <w:pPr>
+              <w:pStyle w:val="20"/>
+              <w:spacing w:before="13"/>
+              <w:jc w:val="both"/>
+              <w:rPr>
+                <w:rFonts w:ascii="Times New Roman" w:hAnsi="Times New Roman" w:cs="Times New Roman"/>
+                <w:b/>
+                <w:sz w:val="24"/>
+                <w:szCs w:val="24"/>
+              </w:rPr>
+            </w:pPr>
+            <w:r>
+              <w:rPr>
+                <w:rFonts w:ascii="Times New Roman" w:hAnsi="Times New Roman" w:cs="Times New Roman"/>
+                <w:b/>
+                <w:sz w:val="24"/>
+                <w:szCs w:val="24"/>
+              </w:rPr>
+              <w:t>复核人</w:t>
+            </w:r>
+            <w:r>
+              <w:rPr>
+                <w:rFonts w:ascii="Times New Roman" w:hAnsi="Times New Roman" w:cs="Times New Roman"/>
+                <w:b/>
+                <w:sz w:val="24"/>
+                <w:szCs w:val="24"/>
+                <w:lang w:eastAsia="zh-CN"/>
+              </w:rPr>
+              <w:t>：</w:t>
+            </w:r>
+          </w:p>
+        </w:tc>
+        <w:tc>
+          <w:tcPr>
+            <w:tcW w:w="2294" w:type="dxa"/>
+            <w:vAlign w:val="center"/>
+          </w:tcPr>
+          <w:p>
+            <w:pPr>
+              <w:pStyle w:val="20"/>
+              <w:spacing w:before="13"/>
+              <w:ind w:right="15"/>
+              <w:jc w:val="both"/>
+              <w:rPr>
+                <w:rFonts w:ascii="Times New Roman" w:hAnsi="Times New Roman" w:cs="Times New Roman"/>
+                <w:b/>
+                <w:sz w:val="24"/>
+                <w:szCs w:val="24"/>
+              </w:rPr>
+            </w:pPr>
+          </w:p>
+        </w:tc>
+      </w:tr>
+      <w:tr>
+        <w:tblPrEx>
+          <w:tblCellMar>
+            <w:top w:w="0" w:type="dxa"/>
+            <w:left w:w="0" w:type="dxa"/>
+            <w:bottom w:w="0" w:type="dxa"/>
+            <w:right w:w="0" w:type="dxa"/>
+          </w:tblCellMar>
+        </w:tblPrEx>
+        <w:trPr>
+          <w:trHeight w:val="457" w:hRule="exact"/>
+          <w:jc w:val="right"/>
+        </w:trPr>
+        <w:tc>
+          <w:tcPr>
+            <w:tcW w:w="1272" w:type="dxa"/>
+            <w:vAlign w:val="center"/>
+          </w:tcPr>
+          <w:p>
+            <w:pPr>
+              <w:pStyle w:val="20"/>
+              <w:spacing w:line="341" w:lineRule="exact"/>
+              <w:ind w:left="13" w:right="165"/>
+              <w:jc w:val="both"/>
+              <w:rPr>
+                <w:rFonts w:ascii="Times New Roman" w:hAnsi="Times New Roman" w:cs="Times New Roman"/>
+                <w:b/>
+                <w:sz w:val="24"/>
+                <w:szCs w:val="24"/>
+              </w:rPr>
+            </w:pPr>
+            <w:r>
+              <w:rPr>
+                <w:rFonts w:ascii="Times New Roman" w:hAnsi="Times New Roman" w:cs="Times New Roman"/>
+                <w:b/>
+                <w:sz w:val="24"/>
+                <w:szCs w:val="24"/>
+              </w:rPr>
+              <w:t>日</w:t>
+            </w:r>
+            <w:r>
+              <w:rPr>
+                <w:rFonts w:ascii="Times New Roman" w:hAnsi="Times New Roman" w:cs="Times New Roman"/>
+                <w:b/>
+                <w:sz w:val="24"/>
+                <w:szCs w:val="24"/>
+                <w:lang w:eastAsia="zh-CN"/>
+              </w:rPr>
+              <w:t xml:space="preserve">  </w:t>
+            </w:r>
+            <w:r>
+              <w:rPr>
+                <w:rFonts w:ascii="Times New Roman" w:hAnsi="Times New Roman" w:cs="Times New Roman"/>
+                <w:b/>
+                <w:sz w:val="24"/>
+                <w:szCs w:val="24"/>
+              </w:rPr>
+              <w:t>期：</w:t>
+            </w:r>
+          </w:p>
+        </w:tc>
+        <w:tc>
+          <w:tcPr>
+            <w:tcW w:w="2040" w:type="dxa"/>
+            <w:vAlign w:val="center"/>
+          </w:tcPr>
+          <w:p>
+            <w:pPr>
+              <w:pStyle w:val="20"/>
+              <w:spacing w:line="363" w:lineRule="exact"/>
+              <w:jc w:val="both"/>
+              <w:rPr>
+                <w:rFonts w:ascii="Times New Roman" w:hAnsi="Times New Roman" w:cs="Times New Roman"/>
+                <w:sz w:val="24"/>
+                <w:szCs w:val="24"/>
+              </w:rPr>
+            </w:pPr>
+            <w:r>
+              <w:rPr>
+                <w:rFonts w:ascii="Times New Roman" w:hAnsi="Times New Roman" w:cs="Times New Roman"/>
+                <w:kern w:val="2"/>
+                <w:sz w:val="24"/>
+                <w:szCs w:val="24"/>
+                <w:lang w:eastAsia="zh-CN"/>
+              </w:rPr>
+              <w:t>{{ reportdate }}</w:t>
+            </w:r>
+          </w:p>
+        </w:tc>
+        <w:tc>
+          <w:tcPr>
+            <w:tcW w:w="1166" w:type="dxa"/>
+            <w:vAlign w:val="center"/>
+          </w:tcPr>
+          <w:p>
+            <w:pPr>
+              <w:pStyle w:val="20"/>
+              <w:spacing w:line="341" w:lineRule="exact"/>
+              <w:jc w:val="both"/>
+              <w:rPr>
+                <w:rFonts w:ascii="Times New Roman" w:hAnsi="Times New Roman" w:cs="Times New Roman"/>
+                <w:b/>
+                <w:sz w:val="24"/>
+                <w:szCs w:val="24"/>
+              </w:rPr>
+            </w:pPr>
+            <w:r>
+              <w:rPr>
+                <w:rFonts w:ascii="Times New Roman" w:hAnsi="Times New Roman" w:cs="Times New Roman"/>
+                <w:b/>
+                <w:sz w:val="24"/>
+                <w:szCs w:val="24"/>
+              </w:rPr>
+              <w:t>日</w:t>
+            </w:r>
+            <w:r>
+              <w:rPr>
+                <w:rFonts w:ascii="Times New Roman" w:hAnsi="Times New Roman" w:cs="Times New Roman"/>
+                <w:b/>
+                <w:sz w:val="24"/>
+                <w:szCs w:val="24"/>
+                <w:lang w:eastAsia="zh-CN"/>
+              </w:rPr>
+              <w:t xml:space="preserve">  </w:t>
+            </w:r>
+            <w:r>
+              <w:rPr>
+                <w:rFonts w:ascii="Times New Roman" w:hAnsi="Times New Roman" w:cs="Times New Roman"/>
+                <w:b/>
+                <w:sz w:val="24"/>
+                <w:szCs w:val="24"/>
+              </w:rPr>
+              <w:t>期：</w:t>
+            </w:r>
+          </w:p>
+        </w:tc>
+        <w:tc>
+          <w:tcPr>
+            <w:tcW w:w="2294" w:type="dxa"/>
+            <w:vAlign w:val="center"/>
+          </w:tcPr>
+          <w:p>
+            <w:pPr>
+              <w:pStyle w:val="20"/>
+              <w:spacing w:line="363" w:lineRule="exact"/>
+              <w:ind w:right="15"/>
+              <w:jc w:val="both"/>
+              <w:rPr>
+                <w:rFonts w:ascii="Times New Roman" w:hAnsi="Times New Roman" w:cs="Times New Roman"/>
+                <w:sz w:val="24"/>
+                <w:szCs w:val="24"/>
+              </w:rPr>
+            </w:pPr>
+            <w:r>
+              <w:rPr>
+                <w:rFonts w:ascii="Times New Roman" w:hAnsi="Times New Roman" w:cs="Times New Roman"/>
+                <w:kern w:val="2"/>
+                <w:sz w:val="24"/>
+                <w:szCs w:val="24"/>
+                <w:lang w:eastAsia="zh-CN"/>
+              </w:rPr>
+              <w:t>{{ reportdate }}</w:t>
+            </w:r>
+          </w:p>
+        </w:tc>
+      </w:tr>
+    </w:tbl>
+    <w:p>
+      <w:pPr>
+        <w:rPr>
+          <w:rFonts w:ascii="Times New Roman" w:hAnsi="Times New Roman" w:eastAsia="微软雅黑" w:cs="Times New Roman"/>
           <w:b/>
           <w:bCs/>
           <w:color w:val="00B050"/>
@@ -8873,13 +8460,13 @@
           </w14:shadow>
         </w:rPr>
       </w:pPr>
-      <w:bookmarkStart w:id="31" w:name="_Toc2866"/>
-      <w:bookmarkStart w:id="32" w:name="_Toc107825550"/>
-      <w:bookmarkStart w:id="33" w:name="_Toc19173"/>
-      <w:bookmarkStart w:id="34" w:name="_Toc22132"/>
+      <w:bookmarkStart w:id="31" w:name="_Toc107825550"/>
+      <w:bookmarkStart w:id="32" w:name="_Toc19173"/>
+      <w:bookmarkStart w:id="33" w:name="_Toc2781"/>
+      <w:bookmarkStart w:id="34" w:name="_Toc19898_WPSOffice_Level1"/>
       <w:bookmarkStart w:id="35" w:name="_Toc24235"/>
-      <w:bookmarkStart w:id="36" w:name="_Toc19898_WPSOffice_Level1"/>
-      <w:bookmarkStart w:id="37" w:name="_Toc2781"/>
+      <w:bookmarkStart w:id="36" w:name="_Toc22132"/>
+      <w:bookmarkStart w:id="37" w:name="_Toc2866"/>
       <w:bookmarkStart w:id="38" w:name="_Toc20136_WPSOffice_Level1"/>
       <w:r>
         <w:rPr>
@@ -8920,9 +8507,9 @@
           <w:sz w:val="30"/>
         </w:rPr>
       </w:pPr>
-      <w:bookmarkStart w:id="39" w:name="_Toc4669"/>
+      <w:bookmarkStart w:id="39" w:name="_Toc107825551"/>
       <w:bookmarkStart w:id="40" w:name="_Toc17240"/>
-      <w:bookmarkStart w:id="41" w:name="_Toc107825551"/>
+      <w:bookmarkStart w:id="41" w:name="_Toc4669"/>
       <w:r>
         <w:rPr>
           <w:rFonts w:hint="eastAsia"/>
@@ -9442,14 +9029,14 @@
           <w:lang w:eastAsia="zh-CN"/>
         </w:rPr>
       </w:pPr>
-      <w:bookmarkStart w:id="42" w:name="_Toc25727"/>
+      <w:bookmarkStart w:id="42" w:name="_Toc23903"/>
       <w:bookmarkStart w:id="43" w:name="_Toc32443_WPSOffice_Level1"/>
-      <w:bookmarkStart w:id="44" w:name="_Toc23903"/>
-      <w:bookmarkStart w:id="45" w:name="_Toc23846_WPSOffice_Level1"/>
-      <w:bookmarkStart w:id="46" w:name="_Toc107825555"/>
+      <w:bookmarkStart w:id="44" w:name="_Toc23846_WPSOffice_Level1"/>
+      <w:bookmarkStart w:id="45" w:name="_Toc25727"/>
+      <w:bookmarkStart w:id="46" w:name="_Toc29372"/>
       <w:bookmarkStart w:id="47" w:name="_Toc4331_WPSOffice_Level1"/>
       <w:bookmarkStart w:id="48" w:name="_Toc180"/>
-      <w:bookmarkStart w:id="49" w:name="_Toc29372"/>
+      <w:bookmarkStart w:id="49" w:name="_Toc107825555"/>
       <w:r>
         <w:rPr>
           <w:rFonts w:hint="eastAsia" w:ascii="Times New Roman" w:hAnsi="Times New Roman" w:eastAsia="微软雅黑" w:cs="Times New Roman"/>
@@ -9511,9 +9098,9 @@
         </w:rPr>
       </w:pPr>
       <w:bookmarkStart w:id="50" w:name="_Toc20034"/>
-      <w:bookmarkStart w:id="51" w:name="_Toc106719764"/>
+      <w:bookmarkStart w:id="51" w:name="_Toc22176"/>
       <w:bookmarkStart w:id="52" w:name="_Toc10223"/>
-      <w:bookmarkStart w:id="53" w:name="_Toc22176"/>
+      <w:bookmarkStart w:id="53" w:name="_Toc106719764"/>
       <w:r>
         <w:rPr>
           <w:rFonts w:hint="eastAsia"/>
@@ -12640,11 +12227,11 @@
           <w:lang w:eastAsia="zh-CN"/>
         </w:rPr>
       </w:pPr>
-      <w:bookmarkStart w:id="55" w:name="_Toc21881"/>
-      <w:bookmarkStart w:id="56" w:name="_Toc107330125"/>
-      <w:bookmarkStart w:id="57" w:name="_Toc10233"/>
-      <w:bookmarkStart w:id="58" w:name="_Toc107825556"/>
-      <w:bookmarkStart w:id="59" w:name="_Toc19894"/>
+      <w:bookmarkStart w:id="55" w:name="_Toc10233"/>
+      <w:bookmarkStart w:id="56" w:name="_Toc21881"/>
+      <w:bookmarkStart w:id="57" w:name="_Toc107825556"/>
+      <w:bookmarkStart w:id="58" w:name="_Toc19894"/>
+      <w:bookmarkStart w:id="59" w:name="_Toc107330125"/>
       <w:r>
         <w:rPr>
           <w:rFonts w:hint="eastAsia"/>
@@ -17102,15 +16689,15 @@
           </w14:shadow>
         </w:rPr>
       </w:pPr>
-      <w:bookmarkStart w:id="60" w:name="_Toc11294"/>
-      <w:bookmarkStart w:id="61" w:name="_Toc107825561"/>
-      <w:bookmarkStart w:id="62" w:name="_Toc28240"/>
-      <w:bookmarkStart w:id="63" w:name="_Toc1707_WPSOffice_Level1"/>
-      <w:bookmarkStart w:id="64" w:name="_Toc21764_WPSOffice_Level1"/>
-      <w:bookmarkStart w:id="65" w:name="_Toc13698"/>
-      <w:bookmarkStart w:id="66" w:name="_Toc27302"/>
-      <w:bookmarkStart w:id="67" w:name="_Toc11283"/>
-      <w:bookmarkStart w:id="68" w:name="_Toc13196_WPSOffice_Level1"/>
+      <w:bookmarkStart w:id="60" w:name="_Toc107825561"/>
+      <w:bookmarkStart w:id="61" w:name="_Toc27302"/>
+      <w:bookmarkStart w:id="62" w:name="_Toc13196_WPSOffice_Level1"/>
+      <w:bookmarkStart w:id="63" w:name="_Toc21764_WPSOffice_Level1"/>
+      <w:bookmarkStart w:id="64" w:name="_Toc28240"/>
+      <w:bookmarkStart w:id="65" w:name="_Toc11283"/>
+      <w:bookmarkStart w:id="66" w:name="_Toc1707_WPSOffice_Level1"/>
+      <w:bookmarkStart w:id="67" w:name="_Toc11294"/>
+      <w:bookmarkStart w:id="68" w:name="_Toc13698"/>
       <w:r>
         <w:rPr>
           <w:rStyle w:val="37"/>
@@ -17151,14 +16738,14 @@
           <w:lang w:eastAsia="zh-CN"/>
         </w:rPr>
       </w:pPr>
-      <w:bookmarkStart w:id="69" w:name="_Toc14255_WPSOffice_Level1"/>
-      <w:bookmarkStart w:id="70" w:name="_Toc9066"/>
-      <w:bookmarkStart w:id="71" w:name="_Toc3674"/>
-      <w:bookmarkStart w:id="72" w:name="_Toc28605"/>
-      <w:bookmarkStart w:id="73" w:name="_Toc2944"/>
-      <w:bookmarkStart w:id="74" w:name="_Toc24085_WPSOffice_Level1"/>
-      <w:bookmarkStart w:id="75" w:name="_Toc15840_WPSOffice_Level1"/>
-      <w:bookmarkStart w:id="76" w:name="_Toc32150"/>
+      <w:bookmarkStart w:id="69" w:name="_Toc15840_WPSOffice_Level1"/>
+      <w:bookmarkStart w:id="70" w:name="_Toc32150"/>
+      <w:bookmarkStart w:id="71" w:name="_Toc14255_WPSOffice_Level1"/>
+      <w:bookmarkStart w:id="72" w:name="_Toc24085_WPSOffice_Level1"/>
+      <w:bookmarkStart w:id="73" w:name="_Toc3674"/>
+      <w:bookmarkStart w:id="74" w:name="_Toc9066"/>
+      <w:bookmarkStart w:id="75" w:name="_Toc28605"/>
+      <w:bookmarkStart w:id="76" w:name="_Toc2944"/>
       <w:bookmarkStart w:id="77" w:name="_Toc11896_WPSOffice_Level1"/>
       <w:bookmarkStart w:id="78" w:name="_Toc23688"/>
       <w:bookmarkStart w:id="79" w:name="_Toc11193_WPSOffice_Level1"/>
@@ -19452,7 +19039,18 @@
           <w:szCs w:val="18"/>
           <w:lang w:eastAsia="zh-CN"/>
         </w:rPr>
-        <w:t>总体质量评估：总体质量评估：根据DNA平均测序深度进行评估，分为“合格”、“警戒</w:t>
+        <w:t>总体质量评估：</w:t>
+      </w:r>
+      <w:bookmarkStart w:id="119" w:name="_GoBack"/>
+      <w:bookmarkEnd w:id="119"/>
+      <w:r>
+        <w:rPr>
+          <w:rFonts w:hint="eastAsia" w:ascii="Times New Roman" w:hAnsi="Times New Roman" w:eastAsia="微软雅黑"/>
+          <w:sz w:val="18"/>
+          <w:szCs w:val="18"/>
+          <w:lang w:eastAsia="zh-CN"/>
+        </w:rPr>
+        <w:t>根据DNA平均测序深度进行评估，分为“合格”、“警戒</w:t>
       </w:r>
       <w:r>
         <w:rPr>
@@ -19523,8 +19121,8 @@
         </w:rPr>
       </w:pPr>
       <w:bookmarkStart w:id="81" w:name="_Toc19415"/>
-      <w:bookmarkStart w:id="82" w:name="_Toc107825565"/>
-      <w:bookmarkStart w:id="83" w:name="_Toc28256"/>
+      <w:bookmarkStart w:id="82" w:name="_Toc28256"/>
+      <w:bookmarkStart w:id="83" w:name="_Toc107825565"/>
       <w:r>
         <w:rPr>
           <w:rFonts w:hint="eastAsia"/>
@@ -20423,7 +20021,7 @@
                     </pic:cNvPicPr>
                   </pic:nvPicPr>
                   <pic:blipFill>
-                    <a:blip r:embed="rId18"/>
+                    <a:blip r:embed="rId16"/>
                     <a:stretch>
                       <a:fillRect/>
                     </a:stretch>
@@ -20491,9 +20089,9 @@
           <w:lang w:eastAsia="zh-CN"/>
         </w:rPr>
       </w:pPr>
-      <w:bookmarkStart w:id="87" w:name="_Toc20874"/>
+      <w:bookmarkStart w:id="87" w:name="_Toc107825567"/>
       <w:bookmarkStart w:id="88" w:name="_Toc31498"/>
-      <w:bookmarkStart w:id="89" w:name="_Toc107825567"/>
+      <w:bookmarkStart w:id="89" w:name="_Toc20874"/>
       <w:r>
         <w:rPr>
           <w:rFonts w:hint="eastAsia"/>
@@ -20934,8 +20532,8 @@
           <w:lang w:eastAsia="zh-CN"/>
         </w:rPr>
       </w:pPr>
-      <w:bookmarkStart w:id="90" w:name="_Toc16486"/>
-      <w:bookmarkStart w:id="91" w:name="_Toc18576"/>
+      <w:bookmarkStart w:id="90" w:name="_Toc18576"/>
+      <w:bookmarkStart w:id="91" w:name="_Toc16486"/>
       <w:r>
         <w:rPr>
           <w:rFonts w:hint="eastAsia" w:ascii="Times New Roman" w:hAnsi="Times New Roman" w:eastAsia="微软雅黑" w:cs="Times New Roman"/>
@@ -21199,10 +20797,10 @@
           <w:lang w:eastAsia="zh-CN"/>
         </w:rPr>
       </w:pPr>
-      <w:bookmarkStart w:id="92" w:name="_Toc5400"/>
-      <w:bookmarkStart w:id="93" w:name="_Toc32060"/>
+      <w:bookmarkStart w:id="92" w:name="_Toc331"/>
+      <w:bookmarkStart w:id="93" w:name="_Toc5400"/>
       <w:bookmarkStart w:id="94" w:name="_Toc3846"/>
-      <w:bookmarkStart w:id="95" w:name="_Toc331"/>
+      <w:bookmarkStart w:id="95" w:name="_Toc32060"/>
       <w:r>
         <w:rPr>
           <w:rFonts w:ascii="Times New Roman" w:hAnsi="Times New Roman" w:eastAsia="微软雅黑" w:cs="Times New Roman"/>
@@ -21333,8 +20931,8 @@
           <w:lang w:eastAsia="zh-CN"/>
         </w:rPr>
       </w:pPr>
-      <w:bookmarkStart w:id="96" w:name="_Toc22196"/>
-      <w:bookmarkStart w:id="97" w:name="_Toc10299"/>
+      <w:bookmarkStart w:id="96" w:name="_Toc10299"/>
+      <w:bookmarkStart w:id="97" w:name="_Toc22196"/>
       <w:bookmarkStart w:id="98" w:name="_Toc5423"/>
       <w:bookmarkStart w:id="99" w:name="_Toc126"/>
       <w:r>
@@ -21472,8 +21070,6 @@
         </w:rPr>
         <w:t>家</w:t>
       </w:r>
-      <w:bookmarkStart w:id="119" w:name="_GoBack"/>
-      <w:bookmarkEnd w:id="119"/>
       <w:r>
         <w:rPr>
           <w:rFonts w:hint="eastAsia" w:ascii="Times New Roman" w:hAnsi="Times New Roman" w:eastAsia="微软雅黑" w:cs="Times New Roman"/>
@@ -21536,14 +21132,14 @@
           <w:lang w:eastAsia="zh-CN"/>
         </w:rPr>
       </w:pPr>
-      <w:bookmarkStart w:id="100" w:name="_Toc3409"/>
-      <w:bookmarkStart w:id="101" w:name="_Toc18623"/>
+      <w:bookmarkStart w:id="100" w:name="_Toc18623"/>
+      <w:bookmarkStart w:id="101" w:name="_Toc3409"/>
       <w:bookmarkStart w:id="102" w:name="_Toc15114"/>
-      <w:bookmarkStart w:id="103" w:name="_Toc27034"/>
-      <w:bookmarkStart w:id="104" w:name="_Toc5476"/>
-      <w:bookmarkStart w:id="105" w:name="_Toc28454_WPSOffice_Level1"/>
-      <w:bookmarkStart w:id="106" w:name="_Toc107825570"/>
-      <w:bookmarkStart w:id="107" w:name="_Toc20170_WPSOffice_Level1"/>
+      <w:bookmarkStart w:id="103" w:name="_Toc28454_WPSOffice_Level1"/>
+      <w:bookmarkStart w:id="104" w:name="_Toc107825570"/>
+      <w:bookmarkStart w:id="105" w:name="_Toc27034"/>
+      <w:bookmarkStart w:id="106" w:name="_Toc20170_WPSOffice_Level1"/>
+      <w:bookmarkStart w:id="107" w:name="_Toc5476"/>
       <w:bookmarkStart w:id="108" w:name="_Toc26985_WPSOffice_Level1"/>
       <w:r>
         <w:rPr>
@@ -21764,14 +21360,14 @@
           <w:lang w:eastAsia="zh-CN"/>
         </w:rPr>
       </w:pPr>
-      <w:bookmarkStart w:id="109" w:name="_Toc21361"/>
-      <w:bookmarkStart w:id="110" w:name="_Toc27448"/>
+      <w:bookmarkStart w:id="109" w:name="_Toc27448"/>
+      <w:bookmarkStart w:id="110" w:name="_Toc21361"/>
       <w:bookmarkStart w:id="111" w:name="_Toc9662"/>
       <w:bookmarkStart w:id="112" w:name="_Toc107825571"/>
-      <w:bookmarkStart w:id="113" w:name="_Toc17792_WPSOffice_Level2"/>
+      <w:bookmarkStart w:id="113" w:name="_Toc19584_WPSOffice_Level1"/>
       <w:bookmarkStart w:id="114" w:name="_Toc13275"/>
-      <w:bookmarkStart w:id="115" w:name="_Toc22162_WPSOffice_Level1"/>
-      <w:bookmarkStart w:id="116" w:name="_Toc19584_WPSOffice_Level1"/>
+      <w:bookmarkStart w:id="115" w:name="_Toc17792_WPSOffice_Level2"/>
+      <w:bookmarkStart w:id="116" w:name="_Toc22162_WPSOffice_Level1"/>
       <w:bookmarkStart w:id="117" w:name="_Toc14611_WPSOffice_Level1"/>
       <w:bookmarkStart w:id="118" w:name="_Toc22623"/>
       <w:r>
@@ -25502,16 +25098,11 @@
   <customSectProps>
     <customSectPr/>
     <customSectPr/>
-    <customSectPr/>
   </customSectProps>
   <customShpExts>
     <customShpInfo spid="_x0000_s1026" textRotate="1"/>
   </customShpExts>
 </s:customData>
-</file>
-
-<file path=customXml/item2.xml><?xml version="1.0" encoding="utf-8"?>
-<b:Sources xmlns:b="http://schemas.openxmlformats.org/officeDocument/2006/bibliography" xmlns="http://schemas.openxmlformats.org/officeDocument/2006/bibliography" SelectedStyle="\APA.XSL" StyleName="APA"/>
 </file>
 
 <file path=customXml/itemProps1.xml><?xml version="1.0" encoding="utf-8"?>
@@ -25520,10 +25111,4 @@
     <ds:schemaRef ds:uri="http://www.wps.cn/officeDocument/2013/wpsCustomData"/>
   </ds:schemaRefs>
 </ds:datastoreItem>
-</file>
-
-<file path=customXml/itemProps2.xml><?xml version="1.0" encoding="utf-8"?>
-<ds:datastoreItem xmlns:ds="http://schemas.openxmlformats.org/officeDocument/2006/customXml" ds:itemID="{330A7792-0DC3-4D00-8C3E-D79273CD5DCA}">
-  <ds:schemaRefs/>
-</ds:datastoreItem>
 </file>
</xml_diff>

<commit_message>
template: 20250121 更新HRD 最新模板
</commit_message>
<xml_diff>
--- a/WebContent/docx/HRDscore报告-佛山市第一人民医院.docx
+++ b/WebContent/docx/HRDscore报告-佛山市第一人民医院.docx
@@ -709,7 +709,7 @@
           </mc:Choice>
           <mc:Fallback>
             <w:pict>
-              <v:group id="_x0000_s1026" o:spid="_x0000_s1026" o:spt="203" style="position:absolute;left:0pt;margin-left:-26.35pt;margin-top:-60.8pt;height:89.6pt;width:528.6pt;z-index:251661312;mso-width-relative:page;mso-height-relative:page;" coordorigin="2472,581" coordsize="10572,1792" o:gfxdata="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">
+              <v:group id="_x0000_s1026" o:spid="_x0000_s1026" o:spt="203" style="position:absolute;left:0pt;margin-left:-26.35pt;margin-top:-60.8pt;height:89.6pt;width:528.6pt;z-index:251661312;mso-width-relative:page;mso-height-relative:page;" coordorigin="2472,581" coordsize="10572,1792" o:gfxdata="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">
                 <o:lock v:ext="edit" aspectratio="f"/>
                 <v:shape id="图片 8" o:spid="_x0000_s1026" o:spt="75" type="#_x0000_t75" style="position:absolute;left:2472;top:581;height:1793;width:1648;" filled="f" o:preferrelative="t" stroked="f" coordsize="21600,21600" o:gfxdata="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">
                   <v:fill on="f" focussize="0,0"/>
@@ -3134,15 +3134,15 @@
           </w14:shadow>
         </w:rPr>
       </w:pPr>
-      <w:bookmarkStart w:id="2" w:name="_Toc21669"/>
-      <w:bookmarkStart w:id="3" w:name="_Toc107825547"/>
-      <w:bookmarkStart w:id="4" w:name="_Toc6873"/>
-      <w:bookmarkStart w:id="5" w:name="_Toc21009_WPSOffice_Level1"/>
-      <w:bookmarkStart w:id="6" w:name="_Toc14123"/>
-      <w:bookmarkStart w:id="7" w:name="_Toc30143_WPSOffice_Level1"/>
-      <w:bookmarkStart w:id="8" w:name="_Toc13806"/>
-      <w:bookmarkStart w:id="9" w:name="_Toc3619"/>
-      <w:bookmarkStart w:id="10" w:name="_Toc24178_WPSOffice_Level1"/>
+      <w:bookmarkStart w:id="2" w:name="_Toc14123"/>
+      <w:bookmarkStart w:id="3" w:name="_Toc6873"/>
+      <w:bookmarkStart w:id="4" w:name="_Toc3619"/>
+      <w:bookmarkStart w:id="5" w:name="_Toc30143_WPSOffice_Level1"/>
+      <w:bookmarkStart w:id="6" w:name="_Toc21669"/>
+      <w:bookmarkStart w:id="7" w:name="_Toc107825547"/>
+      <w:bookmarkStart w:id="8" w:name="_Toc21009_WPSOffice_Level1"/>
+      <w:bookmarkStart w:id="9" w:name="_Toc24178_WPSOffice_Level1"/>
+      <w:bookmarkStart w:id="10" w:name="_Toc13806"/>
       <w:r>
         <w:rPr>
           <w:color w:val="62B541"/>
@@ -4015,14 +4015,14 @@
           </w14:shadow>
         </w:rPr>
       </w:pPr>
-      <w:bookmarkStart w:id="11" w:name="_Toc17451"/>
-      <w:bookmarkStart w:id="12" w:name="_Toc30767"/>
-      <w:bookmarkStart w:id="13" w:name="_Toc29272"/>
-      <w:bookmarkStart w:id="14" w:name="_Toc11015_WPSOffice_Level1"/>
-      <w:bookmarkStart w:id="15" w:name="_Toc7021_WPSOffice_Level1"/>
-      <w:bookmarkStart w:id="16" w:name="_Toc107825548"/>
-      <w:bookmarkStart w:id="17" w:name="_Toc18062_WPSOffice_Level1"/>
-      <w:bookmarkStart w:id="18" w:name="_Toc26731"/>
+      <w:bookmarkStart w:id="11" w:name="_Toc26731"/>
+      <w:bookmarkStart w:id="12" w:name="_Toc29272"/>
+      <w:bookmarkStart w:id="13" w:name="_Toc11015_WPSOffice_Level1"/>
+      <w:bookmarkStart w:id="14" w:name="_Toc17451"/>
+      <w:bookmarkStart w:id="15" w:name="_Toc30767"/>
+      <w:bookmarkStart w:id="16" w:name="_Toc7021_WPSOffice_Level1"/>
+      <w:bookmarkStart w:id="17" w:name="_Toc107825548"/>
+      <w:bookmarkStart w:id="18" w:name="_Toc18062_WPSOffice_Level1"/>
       <w:bookmarkStart w:id="19" w:name="_Toc3823"/>
       <w:r>
         <w:rPr>
@@ -4370,13 +4370,13 @@
           </w14:shadow>
         </w:rPr>
       </w:pPr>
-      <w:bookmarkStart w:id="21" w:name="_Toc25920"/>
-      <w:bookmarkStart w:id="22" w:name="_Toc23369_WPSOffice_Level1"/>
-      <w:bookmarkStart w:id="23" w:name="_Toc18058"/>
-      <w:bookmarkStart w:id="24" w:name="_Toc107825549"/>
-      <w:bookmarkStart w:id="25" w:name="_Toc6221_WPSOffice_Level1"/>
-      <w:bookmarkStart w:id="26" w:name="_Toc12582"/>
-      <w:bookmarkStart w:id="27" w:name="_Toc16576"/>
+      <w:bookmarkStart w:id="21" w:name="_Toc23369_WPSOffice_Level1"/>
+      <w:bookmarkStart w:id="22" w:name="_Toc107825549"/>
+      <w:bookmarkStart w:id="23" w:name="_Toc6221_WPSOffice_Level1"/>
+      <w:bookmarkStart w:id="24" w:name="_Toc25920"/>
+      <w:bookmarkStart w:id="25" w:name="_Toc18058"/>
+      <w:bookmarkStart w:id="26" w:name="_Toc16576"/>
+      <w:bookmarkStart w:id="27" w:name="_Toc12582"/>
       <w:bookmarkStart w:id="28" w:name="_Toc24089"/>
       <w:r>
         <w:rPr>
@@ -4446,8 +4446,8 @@
           <w:lang w:eastAsia="zh-CN"/>
         </w:rPr>
       </w:pPr>
-      <w:bookmarkStart w:id="29" w:name="_Toc21897"/>
-      <w:bookmarkStart w:id="30" w:name="_Toc149837254"/>
+      <w:bookmarkStart w:id="29" w:name="_Toc149837254"/>
+      <w:bookmarkStart w:id="30" w:name="_Toc21897"/>
       <w:r>
         <w:rPr>
           <w:rFonts w:hint="eastAsia"/>
@@ -4497,12 +4497,6 @@
             <w:insideH w:val="single" w:color="A4A4A4" w:sz="4" w:space="0"/>
             <w:insideV w:val="single" w:color="A4A4A4" w:sz="4" w:space="0"/>
           </w:tblBorders>
-          <w:tblCellMar>
-            <w:top w:w="0" w:type="dxa"/>
-            <w:left w:w="0" w:type="dxa"/>
-            <w:bottom w:w="0" w:type="dxa"/>
-            <w:right w:w="0" w:type="dxa"/>
-          </w:tblCellMar>
         </w:tblPrEx>
         <w:trPr>
           <w:trHeight w:val="490" w:hRule="atLeast"/>
@@ -5559,7 +5553,6 @@
                 <w:szCs w:val="24"/>
               </w:rPr>
             </w:pPr>
-            <w:bookmarkStart w:id="119" w:name="_GoBack"/>
             <w:r>
               <w:rPr>
                 <w:sz w:val="22"/>
@@ -5739,7 +5732,6 @@
                 </mc:Fallback>
               </mc:AlternateContent>
             </w:r>
-            <w:bookmarkEnd w:id="119"/>
           </w:p>
         </w:tc>
         <w:tc>
@@ -6269,7 +6261,7 @@
                 </mc:Choice>
                 <mc:Fallback>
                   <w:pict>
-                    <v:group id="_x0000_s1026" o:spid="_x0000_s1026" o:spt="203" style="position:absolute;left:0pt;margin-left:0pt;margin-top:-38.65pt;height:113.6pt;width:246.9pt;z-index:251664384;mso-width-relative:page;mso-height-relative:page;" coordorigin="17956,39496" coordsize="4938,2272" o:gfxdata="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">
+                    <v:group id="_x0000_s1026" o:spid="_x0000_s1026" o:spt="203" style="position:absolute;left:0pt;margin-left:0pt;margin-top:-38.65pt;height:113.6pt;width:246.9pt;z-index:251664384;mso-width-relative:page;mso-height-relative:page;" coordorigin="17956,39496" coordsize="4938,2272" o:gfxdata="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">
                       <o:lock v:ext="edit" aspectratio="f"/>
                       <v:group id="组合 30" o:spid="_x0000_s1026" o:spt="203" style="position:absolute;left:17956;top:40098;height:570;width:4213;" coordorigin="17956,40098" coordsize="4213,570" o:gfxdata="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">
                         <o:lock v:ext="edit" aspectratio="f"/>
@@ -6830,7 +6822,7 @@
                 </mc:Choice>
                 <mc:Fallback>
                   <w:pict>
-                    <v:group id="_x0000_s1026" o:spid="_x0000_s1026" o:spt="203" style="position:absolute;left:0pt;margin-left:-4.7pt;margin-top:-41.55pt;height:113.6pt;width:245.2pt;z-index:251665408;mso-width-relative:page;mso-height-relative:page;" coordorigin="17862,41199" coordsize="4904,2272" o:gfxdata="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">
+                    <v:group id="_x0000_s1026" o:spid="_x0000_s1026" o:spt="203" style="position:absolute;left:0pt;margin-left:-4.7pt;margin-top:-41.55pt;height:113.6pt;width:245.2pt;z-index:251665408;mso-width-relative:page;mso-height-relative:page;" coordorigin="17862,41199" coordsize="4904,2272" o:gfxdata="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">
                       <o:lock v:ext="edit" aspectratio="f"/>
                       <v:shape id="图片 23" o:spid="_x0000_s1026" o:spt="75" type="#_x0000_t75" style="position:absolute;left:20494;top:41199;height:2273;width:2273;" filled="f" o:preferrelative="t" stroked="f" coordsize="21600,21600" o:gfxdata="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">
                         <v:fill on="f" focussize="0,0"/>
@@ -7393,7 +7385,7 @@
                 </mc:Choice>
                 <mc:Fallback>
                   <w:pict>
-                    <v:group id="_x0000_s1026" o:spid="_x0000_s1026" o:spt="203" style="position:absolute;left:0pt;margin-left:1pt;margin-top:-40.55pt;height:113.6pt;width:248.05pt;z-index:251666432;mso-width-relative:page;mso-height-relative:page;" coordorigin="17976,42945" coordsize="4961,2272" o:gfxdata="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">
+                    <v:group id="_x0000_s1026" o:spid="_x0000_s1026" o:spt="203" style="position:absolute;left:0pt;margin-left:1pt;margin-top:-40.55pt;height:113.6pt;width:248.05pt;z-index:251666432;mso-width-relative:page;mso-height-relative:page;" coordorigin="17976,42945" coordsize="4961,2272" o:gfxdata="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">
                       <o:lock v:ext="edit" aspectratio="f"/>
                       <v:shape id="图片 25" o:spid="_x0000_s1026" o:spt="75" type="#_x0000_t75" style="position:absolute;left:20665;top:42945;height:2273;width:2273;" filled="f" o:preferrelative="t" stroked="f" coordsize="21600,21600" o:gfxdata="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">
                         <v:fill on="f" focussize="0,0"/>
@@ -8119,6 +8111,14 @@
         <w:gridCol w:w="2294"/>
       </w:tblGrid>
       <w:tr>
+        <w:tblPrEx>
+          <w:tblCellMar>
+            <w:top w:w="0" w:type="dxa"/>
+            <w:left w:w="0" w:type="dxa"/>
+            <w:bottom w:w="0" w:type="dxa"/>
+            <w:right w:w="0" w:type="dxa"/>
+          </w:tblCellMar>
+        </w:tblPrEx>
         <w:trPr>
           <w:trHeight w:val="441" w:hRule="exact"/>
           <w:jc w:val="right"/>
@@ -8462,12 +8462,12 @@
       </w:pPr>
       <w:bookmarkStart w:id="31" w:name="_Toc107825550"/>
       <w:bookmarkStart w:id="32" w:name="_Toc19173"/>
-      <w:bookmarkStart w:id="33" w:name="_Toc20136_WPSOffice_Level1"/>
-      <w:bookmarkStart w:id="34" w:name="_Toc2781"/>
-      <w:bookmarkStart w:id="35" w:name="_Toc22132"/>
-      <w:bookmarkStart w:id="36" w:name="_Toc19898_WPSOffice_Level1"/>
-      <w:bookmarkStart w:id="37" w:name="_Toc24235"/>
-      <w:bookmarkStart w:id="38" w:name="_Toc2866"/>
+      <w:bookmarkStart w:id="33" w:name="_Toc2781"/>
+      <w:bookmarkStart w:id="34" w:name="_Toc19898_WPSOffice_Level1"/>
+      <w:bookmarkStart w:id="35" w:name="_Toc24235"/>
+      <w:bookmarkStart w:id="36" w:name="_Toc22132"/>
+      <w:bookmarkStart w:id="37" w:name="_Toc2866"/>
+      <w:bookmarkStart w:id="38" w:name="_Toc20136_WPSOffice_Level1"/>
       <w:r>
         <w:rPr>
           <w:rStyle w:val="37"/>
@@ -8508,8 +8508,8 @@
         </w:rPr>
       </w:pPr>
       <w:bookmarkStart w:id="39" w:name="_Toc107825551"/>
-      <w:bookmarkStart w:id="40" w:name="_Toc4669"/>
-      <w:bookmarkStart w:id="41" w:name="_Toc17240"/>
+      <w:bookmarkStart w:id="40" w:name="_Toc17240"/>
+      <w:bookmarkStart w:id="41" w:name="_Toc4669"/>
       <w:r>
         <w:rPr>
           <w:rFonts w:hint="eastAsia"/>
@@ -8565,6 +8565,12 @@
             <w:insideH w:val="single" w:color="00AF50" w:sz="24" w:space="0"/>
             <w:insideV w:val="single" w:color="00AF50" w:sz="24" w:space="0"/>
           </w:tblBorders>
+          <w:tblCellMar>
+            <w:top w:w="0" w:type="dxa"/>
+            <w:left w:w="0" w:type="dxa"/>
+            <w:bottom w:w="0" w:type="dxa"/>
+            <w:right w:w="0" w:type="dxa"/>
+          </w:tblCellMar>
         </w:tblPrEx>
         <w:trPr>
           <w:trHeight w:val="488" w:hRule="atLeast"/>
@@ -9023,14 +9029,14 @@
           <w:lang w:eastAsia="zh-CN"/>
         </w:rPr>
       </w:pPr>
-      <w:bookmarkStart w:id="42" w:name="_Toc25727"/>
+      <w:bookmarkStart w:id="42" w:name="_Toc23903"/>
       <w:bookmarkStart w:id="43" w:name="_Toc32443_WPSOffice_Level1"/>
-      <w:bookmarkStart w:id="44" w:name="_Toc29372"/>
-      <w:bookmarkStart w:id="45" w:name="_Toc107825555"/>
-      <w:bookmarkStart w:id="46" w:name="_Toc23846_WPSOffice_Level1"/>
+      <w:bookmarkStart w:id="44" w:name="_Toc23846_WPSOffice_Level1"/>
+      <w:bookmarkStart w:id="45" w:name="_Toc25727"/>
+      <w:bookmarkStart w:id="46" w:name="_Toc29372"/>
       <w:bookmarkStart w:id="47" w:name="_Toc4331_WPSOffice_Level1"/>
       <w:bookmarkStart w:id="48" w:name="_Toc180"/>
-      <w:bookmarkStart w:id="49" w:name="_Toc23903"/>
+      <w:bookmarkStart w:id="49" w:name="_Toc107825555"/>
       <w:r>
         <w:rPr>
           <w:rFonts w:hint="eastAsia" w:ascii="Times New Roman" w:hAnsi="Times New Roman" w:eastAsia="微软雅黑" w:cs="Times New Roman"/>
@@ -9092,9 +9098,9 @@
         </w:rPr>
       </w:pPr>
       <w:bookmarkStart w:id="50" w:name="_Toc20034"/>
-      <w:bookmarkStart w:id="51" w:name="_Toc10223"/>
-      <w:bookmarkStart w:id="52" w:name="_Toc106719764"/>
-      <w:bookmarkStart w:id="53" w:name="_Toc22176"/>
+      <w:bookmarkStart w:id="51" w:name="_Toc22176"/>
+      <w:bookmarkStart w:id="52" w:name="_Toc10223"/>
+      <w:bookmarkStart w:id="53" w:name="_Toc106719764"/>
       <w:r>
         <w:rPr>
           <w:rFonts w:hint="eastAsia"/>
@@ -12221,11 +12227,11 @@
           <w:lang w:eastAsia="zh-CN"/>
         </w:rPr>
       </w:pPr>
-      <w:bookmarkStart w:id="55" w:name="_Toc21881"/>
-      <w:bookmarkStart w:id="56" w:name="_Toc10233"/>
-      <w:bookmarkStart w:id="57" w:name="_Toc107330125"/>
-      <w:bookmarkStart w:id="58" w:name="_Toc107825556"/>
-      <w:bookmarkStart w:id="59" w:name="_Toc19894"/>
+      <w:bookmarkStart w:id="55" w:name="_Toc10233"/>
+      <w:bookmarkStart w:id="56" w:name="_Toc21881"/>
+      <w:bookmarkStart w:id="57" w:name="_Toc107825556"/>
+      <w:bookmarkStart w:id="58" w:name="_Toc19894"/>
+      <w:bookmarkStart w:id="59" w:name="_Toc107330125"/>
       <w:r>
         <w:rPr>
           <w:rFonts w:hint="eastAsia"/>
@@ -16683,15 +16689,15 @@
           </w14:shadow>
         </w:rPr>
       </w:pPr>
-      <w:bookmarkStart w:id="60" w:name="_Toc1707_WPSOffice_Level1"/>
-      <w:bookmarkStart w:id="61" w:name="_Toc11294"/>
-      <w:bookmarkStart w:id="62" w:name="_Toc27302"/>
-      <w:bookmarkStart w:id="63" w:name="_Toc13698"/>
-      <w:bookmarkStart w:id="64" w:name="_Toc13196_WPSOffice_Level1"/>
+      <w:bookmarkStart w:id="60" w:name="_Toc107825561"/>
+      <w:bookmarkStart w:id="61" w:name="_Toc27302"/>
+      <w:bookmarkStart w:id="62" w:name="_Toc13196_WPSOffice_Level1"/>
+      <w:bookmarkStart w:id="63" w:name="_Toc21764_WPSOffice_Level1"/>
+      <w:bookmarkStart w:id="64" w:name="_Toc28240"/>
       <w:bookmarkStart w:id="65" w:name="_Toc11283"/>
-      <w:bookmarkStart w:id="66" w:name="_Toc107825561"/>
-      <w:bookmarkStart w:id="67" w:name="_Toc21764_WPSOffice_Level1"/>
-      <w:bookmarkStart w:id="68" w:name="_Toc28240"/>
+      <w:bookmarkStart w:id="66" w:name="_Toc1707_WPSOffice_Level1"/>
+      <w:bookmarkStart w:id="67" w:name="_Toc11294"/>
+      <w:bookmarkStart w:id="68" w:name="_Toc13698"/>
       <w:r>
         <w:rPr>
           <w:rStyle w:val="37"/>
@@ -16732,16 +16738,16 @@
           <w:lang w:eastAsia="zh-CN"/>
         </w:rPr>
       </w:pPr>
-      <w:bookmarkStart w:id="69" w:name="_Toc14255_WPSOffice_Level1"/>
-      <w:bookmarkStart w:id="70" w:name="_Toc24085_WPSOffice_Level1"/>
-      <w:bookmarkStart w:id="71" w:name="_Toc3674"/>
-      <w:bookmarkStart w:id="72" w:name="_Toc9066"/>
-      <w:bookmarkStart w:id="73" w:name="_Toc28605"/>
-      <w:bookmarkStart w:id="74" w:name="_Toc2944"/>
-      <w:bookmarkStart w:id="75" w:name="_Toc15840_WPSOffice_Level1"/>
-      <w:bookmarkStart w:id="76" w:name="_Toc32150"/>
-      <w:bookmarkStart w:id="77" w:name="_Toc23688"/>
-      <w:bookmarkStart w:id="78" w:name="_Toc11896_WPSOffice_Level1"/>
+      <w:bookmarkStart w:id="69" w:name="_Toc15840_WPSOffice_Level1"/>
+      <w:bookmarkStart w:id="70" w:name="_Toc32150"/>
+      <w:bookmarkStart w:id="71" w:name="_Toc14255_WPSOffice_Level1"/>
+      <w:bookmarkStart w:id="72" w:name="_Toc24085_WPSOffice_Level1"/>
+      <w:bookmarkStart w:id="73" w:name="_Toc3674"/>
+      <w:bookmarkStart w:id="74" w:name="_Toc9066"/>
+      <w:bookmarkStart w:id="75" w:name="_Toc28605"/>
+      <w:bookmarkStart w:id="76" w:name="_Toc2944"/>
+      <w:bookmarkStart w:id="77" w:name="_Toc11896_WPSOffice_Level1"/>
+      <w:bookmarkStart w:id="78" w:name="_Toc23688"/>
       <w:bookmarkStart w:id="79" w:name="_Toc11193_WPSOffice_Level1"/>
       <w:bookmarkStart w:id="80" w:name="_Toc28810_WPSOffice_Level1"/>
       <w:r>
@@ -19033,7 +19039,18 @@
           <w:szCs w:val="18"/>
           <w:lang w:eastAsia="zh-CN"/>
         </w:rPr>
-        <w:t>总体质量评估：总体质量评估：根据DNA平均测序深度进行评估，分为“合格”、“警戒</w:t>
+        <w:t>总体质量评估：</w:t>
+      </w:r>
+      <w:bookmarkStart w:id="119" w:name="_GoBack"/>
+      <w:bookmarkEnd w:id="119"/>
+      <w:r>
+        <w:rPr>
+          <w:rFonts w:hint="eastAsia" w:ascii="Times New Roman" w:hAnsi="Times New Roman" w:eastAsia="微软雅黑"/>
+          <w:sz w:val="18"/>
+          <w:szCs w:val="18"/>
+          <w:lang w:eastAsia="zh-CN"/>
+        </w:rPr>
+        <w:t>根据DNA平均测序深度进行评估，分为“合格”、“警戒</w:t>
       </w:r>
       <w:r>
         <w:rPr>
@@ -19103,9 +19120,9 @@
           <w:lang w:eastAsia="zh-CN"/>
         </w:rPr>
       </w:pPr>
-      <w:bookmarkStart w:id="81" w:name="_Toc28256"/>
-      <w:bookmarkStart w:id="82" w:name="_Toc107825565"/>
-      <w:bookmarkStart w:id="83" w:name="_Toc19415"/>
+      <w:bookmarkStart w:id="81" w:name="_Toc19415"/>
+      <w:bookmarkStart w:id="82" w:name="_Toc28256"/>
+      <w:bookmarkStart w:id="83" w:name="_Toc107825565"/>
       <w:r>
         <w:rPr>
           <w:rFonts w:hint="eastAsia"/>
@@ -20515,8 +20532,8 @@
           <w:lang w:eastAsia="zh-CN"/>
         </w:rPr>
       </w:pPr>
-      <w:bookmarkStart w:id="90" w:name="_Toc16486"/>
-      <w:bookmarkStart w:id="91" w:name="_Toc18576"/>
+      <w:bookmarkStart w:id="90" w:name="_Toc18576"/>
+      <w:bookmarkStart w:id="91" w:name="_Toc16486"/>
       <w:r>
         <w:rPr>
           <w:rFonts w:hint="eastAsia" w:ascii="Times New Roman" w:hAnsi="Times New Roman" w:eastAsia="微软雅黑" w:cs="Times New Roman"/>
@@ -20780,10 +20797,10 @@
           <w:lang w:eastAsia="zh-CN"/>
         </w:rPr>
       </w:pPr>
-      <w:bookmarkStart w:id="92" w:name="_Toc32060"/>
-      <w:bookmarkStart w:id="93" w:name="_Toc331"/>
-      <w:bookmarkStart w:id="94" w:name="_Toc5400"/>
-      <w:bookmarkStart w:id="95" w:name="_Toc3846"/>
+      <w:bookmarkStart w:id="92" w:name="_Toc331"/>
+      <w:bookmarkStart w:id="93" w:name="_Toc5400"/>
+      <w:bookmarkStart w:id="94" w:name="_Toc3846"/>
+      <w:bookmarkStart w:id="95" w:name="_Toc32060"/>
       <w:r>
         <w:rPr>
           <w:rFonts w:ascii="Times New Roman" w:hAnsi="Times New Roman" w:eastAsia="微软雅黑" w:cs="Times New Roman"/>
@@ -20914,8 +20931,8 @@
           <w:lang w:eastAsia="zh-CN"/>
         </w:rPr>
       </w:pPr>
-      <w:bookmarkStart w:id="96" w:name="_Toc22196"/>
-      <w:bookmarkStart w:id="97" w:name="_Toc10299"/>
+      <w:bookmarkStart w:id="96" w:name="_Toc10299"/>
+      <w:bookmarkStart w:id="97" w:name="_Toc22196"/>
       <w:bookmarkStart w:id="98" w:name="_Toc5423"/>
       <w:bookmarkStart w:id="99" w:name="_Toc126"/>
       <w:r>
@@ -21118,11 +21135,11 @@
       <w:bookmarkStart w:id="100" w:name="_Toc18623"/>
       <w:bookmarkStart w:id="101" w:name="_Toc3409"/>
       <w:bookmarkStart w:id="102" w:name="_Toc15114"/>
-      <w:bookmarkStart w:id="103" w:name="_Toc5476"/>
-      <w:bookmarkStart w:id="104" w:name="_Toc27034"/>
-      <w:bookmarkStart w:id="105" w:name="_Toc20170_WPSOffice_Level1"/>
-      <w:bookmarkStart w:id="106" w:name="_Toc107825570"/>
-      <w:bookmarkStart w:id="107" w:name="_Toc28454_WPSOffice_Level1"/>
+      <w:bookmarkStart w:id="103" w:name="_Toc28454_WPSOffice_Level1"/>
+      <w:bookmarkStart w:id="104" w:name="_Toc107825570"/>
+      <w:bookmarkStart w:id="105" w:name="_Toc27034"/>
+      <w:bookmarkStart w:id="106" w:name="_Toc20170_WPSOffice_Level1"/>
+      <w:bookmarkStart w:id="107" w:name="_Toc5476"/>
       <w:bookmarkStart w:id="108" w:name="_Toc26985_WPSOffice_Level1"/>
       <w:r>
         <w:rPr>
@@ -21343,16 +21360,16 @@
           <w:lang w:eastAsia="zh-CN"/>
         </w:rPr>
       </w:pPr>
-      <w:bookmarkStart w:id="109" w:name="_Toc21361"/>
-      <w:bookmarkStart w:id="110" w:name="_Toc107825571"/>
-      <w:bookmarkStart w:id="111" w:name="_Toc27448"/>
-      <w:bookmarkStart w:id="112" w:name="_Toc9662"/>
-      <w:bookmarkStart w:id="113" w:name="_Toc17792_WPSOffice_Level2"/>
-      <w:bookmarkStart w:id="114" w:name="_Toc22162_WPSOffice_Level1"/>
-      <w:bookmarkStart w:id="115" w:name="_Toc19584_WPSOffice_Level1"/>
-      <w:bookmarkStart w:id="116" w:name="_Toc14611_WPSOffice_Level1"/>
-      <w:bookmarkStart w:id="117" w:name="_Toc22623"/>
-      <w:bookmarkStart w:id="118" w:name="_Toc13275"/>
+      <w:bookmarkStart w:id="109" w:name="_Toc27448"/>
+      <w:bookmarkStart w:id="110" w:name="_Toc21361"/>
+      <w:bookmarkStart w:id="111" w:name="_Toc9662"/>
+      <w:bookmarkStart w:id="112" w:name="_Toc107825571"/>
+      <w:bookmarkStart w:id="113" w:name="_Toc19584_WPSOffice_Level1"/>
+      <w:bookmarkStart w:id="114" w:name="_Toc13275"/>
+      <w:bookmarkStart w:id="115" w:name="_Toc17792_WPSOffice_Level2"/>
+      <w:bookmarkStart w:id="116" w:name="_Toc22162_WPSOffice_Level1"/>
+      <w:bookmarkStart w:id="117" w:name="_Toc14611_WPSOffice_Level1"/>
+      <w:bookmarkStart w:id="118" w:name="_Toc22623"/>
       <w:r>
         <w:rPr>
           <w:rFonts w:hint="eastAsia"/>

</xml_diff>